<commit_message>
ANALISIS DE RETO 2 - REQ_1 Y REQ_6
</commit_message>
<xml_diff>
--- a/Docs/ISIS1225 - AnalisisReto-TEMPLATE RETO.docx
+++ b/Docs/ISIS1225 - AnalisisReto-TEMPLATE RETO.docx
@@ -1,6 +1,6 @@
 
 <file path=word/document.xml><?xml version="1.0" encoding="utf-8"?>
-<w:document xmlns:wpc="http://schemas.microsoft.com/office/word/2010/wordprocessingCanvas" xmlns:cx="http://schemas.microsoft.com/office/drawing/2014/chartex" xmlns:cx1="http://schemas.microsoft.com/office/drawing/2015/9/8/chartex" xmlns:cx2="http://schemas.microsoft.com/office/drawing/2015/10/21/chartex" xmlns:cx3="http://schemas.microsoft.com/office/drawing/2016/5/9/chartex" xmlns:cx4="http://schemas.microsoft.com/office/drawing/2016/5/10/chartex" xmlns:cx5="http://schemas.microsoft.com/office/drawing/2016/5/11/chartex" xmlns:cx6="http://schemas.microsoft.com/office/drawing/2016/5/12/chartex" xmlns:cx7="http://schemas.microsoft.com/office/drawing/2016/5/13/chartex" xmlns:cx8="http://schemas.microsoft.com/office/drawing/2016/5/14/chartex" xmlns:mc="http://schemas.openxmlformats.org/markup-compatibility/2006" xmlns:aink="http://schemas.microsoft.com/office/drawing/2016/ink" xmlns:am3d="http://schemas.microsoft.com/office/drawing/2017/model3d" xmlns:o="urn:schemas-microsoft-com:office:office" xmlns:oel="http://schemas.microsoft.com/office/2019/extlst" xmlns:r="http://schemas.openxmlformats.org/officeDocument/2006/relationships" xmlns:m="http://schemas.openxmlformats.org/officeDocument/2006/math" xmlns:v="urn:schemas-microsoft-com:vml" xmlns:wp14="http://schemas.microsoft.com/office/word/2010/wordprocessingDrawing" xmlns:wp="http://schemas.openxmlformats.org/drawingml/2006/wordprocessingDrawing" xmlns:w10="urn:schemas-microsoft-com:office:word" xmlns:w="http://schemas.openxmlformats.org/wordprocessingml/2006/main" xmlns:w14="http://schemas.microsoft.com/office/word/2010/wordml" xmlns:w15="http://schemas.microsoft.com/office/word/2012/wordml" xmlns:w16cex="http://schemas.microsoft.com/office/word/2018/wordml/cex" xmlns:w16cid="http://schemas.microsoft.com/office/word/2016/wordml/cid" xmlns:w16="http://schemas.microsoft.com/office/word/2018/wordml" xmlns:w16du="http://schemas.microsoft.com/office/word/2023/wordml/word16du" xmlns:w16sdtdh="http://schemas.microsoft.com/office/word/2020/wordml/sdtdatahash" xmlns:w16sdtfl="http://schemas.microsoft.com/office/word/2024/wordml/sdtformatlock" xmlns:w16se="http://schemas.microsoft.com/office/word/2015/wordml/symex" xmlns:wpg="http://schemas.microsoft.com/office/word/2010/wordprocessingGroup" xmlns:wpi="http://schemas.microsoft.com/office/word/2010/wordprocessingInk" xmlns:wne="http://schemas.microsoft.com/office/word/2006/wordml" xmlns:wps="http://schemas.microsoft.com/office/word/2010/wordprocessingShape" mc:Ignorable="w14 w15 w16se w16cid w16 w16cex w16sdtdh w16sdtfl w16du wp14">
+<w:document xmlns:wpc="http://schemas.microsoft.com/office/word/2010/wordprocessingCanvas" xmlns:cx="http://schemas.microsoft.com/office/drawing/2014/chartex" xmlns:cx1="http://schemas.microsoft.com/office/drawing/2015/9/8/chartex" xmlns:cx2="http://schemas.microsoft.com/office/drawing/2015/10/21/chartex" xmlns:cx3="http://schemas.microsoft.com/office/drawing/2016/5/9/chartex" xmlns:cx4="http://schemas.microsoft.com/office/drawing/2016/5/10/chartex" xmlns:cx5="http://schemas.microsoft.com/office/drawing/2016/5/11/chartex" xmlns:cx6="http://schemas.microsoft.com/office/drawing/2016/5/12/chartex" xmlns:cx7="http://schemas.microsoft.com/office/drawing/2016/5/13/chartex" xmlns:cx8="http://schemas.microsoft.com/office/drawing/2016/5/14/chartex" xmlns:mc="http://schemas.openxmlformats.org/markup-compatibility/2006" xmlns:aink="http://schemas.microsoft.com/office/drawing/2016/ink" xmlns:am3d="http://schemas.microsoft.com/office/drawing/2017/model3d" xmlns:o="urn:schemas-microsoft-com:office:office" xmlns:oel="http://schemas.microsoft.com/office/2019/extlst" xmlns:r="http://schemas.openxmlformats.org/officeDocument/2006/relationships" xmlns:m="http://schemas.openxmlformats.org/officeDocument/2006/math" xmlns:v="urn:schemas-microsoft-com:vml" xmlns:wp14="http://schemas.microsoft.com/office/word/2010/wordprocessingDrawing" xmlns:wp="http://schemas.openxmlformats.org/drawingml/2006/wordprocessingDrawing" xmlns:w10="urn:schemas-microsoft-com:office:word" xmlns:w="http://schemas.openxmlformats.org/wordprocessingml/2006/main" xmlns:w14="http://schemas.microsoft.com/office/word/2010/wordml" xmlns:w15="http://schemas.microsoft.com/office/word/2012/wordml" xmlns:w16cex="http://schemas.microsoft.com/office/word/2018/wordml/cex" xmlns:w16cid="http://schemas.microsoft.com/office/word/2016/wordml/cid" xmlns:w16="http://schemas.microsoft.com/office/word/2018/wordml" xmlns:w16du="http://schemas.microsoft.com/office/word/2023/wordml/word16du" xmlns:w16sdtdh="http://schemas.microsoft.com/office/word/2020/wordml/sdtdatahash" xmlns:w16se="http://schemas.microsoft.com/office/word/2015/wordml/symex" xmlns:wpg="http://schemas.microsoft.com/office/word/2010/wordprocessingGroup" xmlns:wpi="http://schemas.microsoft.com/office/word/2010/wordprocessingInk" xmlns:wne="http://schemas.microsoft.com/office/word/2006/wordml" xmlns:wps="http://schemas.microsoft.com/office/word/2010/wordprocessingShape" mc:Ignorable="w14 w15 w16se w16cid w16 w16cex w16sdtdh w16du wp14">
   <w:body>
     <w:p>
       <w:pPr>
@@ -26,32 +26,100 @@
       <w:pPr>
         <w:jc w:val="right"/>
         <w:rPr>
-          <w:rStyle w:val="nfasis"/>
-          <w:lang w:val="pt-BR"/>
-        </w:rPr>
-      </w:pPr>
-      <w:r>
-        <w:rPr>
-          <w:rStyle w:val="nfasis"/>
-          <w:lang w:val="pt-BR"/>
-        </w:rPr>
-        <w:t>Estudiante 1, código 1, email 1</w:t>
+          <w:i/>
+          <w:iCs/>
+          <w:lang w:val="es-CO"/>
+        </w:rPr>
+      </w:pPr>
+      <w:r>
+        <w:rPr>
+          <w:i/>
+          <w:iCs/>
+          <w:lang w:val="es-CO"/>
+        </w:rPr>
+        <w:t>Juan Sebastian Rojas Marin, </w:t>
+      </w:r>
+      <w:hyperlink r:id="rId11" w:history="1">
+        <w:r>
+          <w:rPr>
+            <w:rStyle w:val="Hipervnculo"/>
+            <w:i/>
+            <w:iCs/>
+            <w:lang w:val="es-CO"/>
+          </w:rPr>
+          <w:t>js.rojasm123@uniandes.edu.co</w:t>
+        </w:r>
+      </w:hyperlink>
+      <w:r>
+        <w:rPr>
+          <w:i/>
+          <w:iCs/>
+          <w:lang w:val="es-CO"/>
+        </w:rPr>
+        <w:t>, 202610140</w:t>
       </w:r>
     </w:p>
     <w:p>
       <w:pPr>
         <w:jc w:val="right"/>
         <w:rPr>
-          <w:rStyle w:val="nfasis"/>
-          <w:lang w:val="pt-BR"/>
-        </w:rPr>
-      </w:pPr>
-      <w:r>
-        <w:rPr>
-          <w:rStyle w:val="nfasis"/>
-          <w:lang w:val="pt-BR"/>
-        </w:rPr>
-        <w:t>Estudiante 2, código 2, email 2</w:t>
+          <w:i/>
+          <w:iCs/>
+          <w:lang w:val="es-CO"/>
+        </w:rPr>
+      </w:pPr>
+      <w:r>
+        <w:rPr>
+          <w:i/>
+          <w:iCs/>
+          <w:lang w:val="es-CO"/>
+        </w:rPr>
+        <w:t xml:space="preserve">Katy </w:t>
+      </w:r>
+      <w:proofErr w:type="spellStart"/>
+      <w:r>
+        <w:rPr>
+          <w:i/>
+          <w:iCs/>
+          <w:lang w:val="es-CO"/>
+        </w:rPr>
+        <w:t>Teran</w:t>
+      </w:r>
+      <w:proofErr w:type="spellEnd"/>
+      <w:r>
+        <w:rPr>
+          <w:i/>
+          <w:iCs/>
+          <w:lang w:val="es-CO"/>
+        </w:rPr>
+        <w:t xml:space="preserve"> Mercado,</w:t>
+      </w:r>
+      <w:r>
+        <w:rPr>
+          <w:i/>
+          <w:iCs/>
+          <w:lang w:val="es-CO"/>
+        </w:rPr>
+        <w:t xml:space="preserve"> </w:t>
+      </w:r>
+      <w:hyperlink r:id="rId12" w:history="1">
+        <w:r>
+          <w:rPr>
+            <w:rStyle w:val="Hipervnculo"/>
+            <w:i/>
+            <w:iCs/>
+            <w:lang w:val="es-CO"/>
+          </w:rPr>
+          <w:t>k.teranm@uniandes.edu.co</w:t>
+        </w:r>
+      </w:hyperlink>
+      <w:r>
+        <w:rPr>
+          <w:i/>
+          <w:iCs/>
+          <w:lang w:val="es-CO"/>
+        </w:rPr>
+        <w:t>, 202614247</w:t>
       </w:r>
     </w:p>
     <w:p>
@@ -59,15 +127,71 @@
         <w:jc w:val="right"/>
         <w:rPr>
           <w:rStyle w:val="nfasis"/>
-          <w:lang w:val="pt-BR"/>
-        </w:rPr>
-      </w:pPr>
-      <w:r>
-        <w:rPr>
-          <w:rStyle w:val="nfasis"/>
-          <w:lang w:val="pt-BR"/>
-        </w:rPr>
-        <w:t>Estudiante 3, código 3, email 3</w:t>
+          <w:lang w:val="es-CO"/>
+        </w:rPr>
+      </w:pPr>
+      <w:r>
+        <w:rPr>
+          <w:i/>
+          <w:iCs/>
+          <w:lang w:val="es-CO"/>
+        </w:rPr>
+        <w:t xml:space="preserve">Juan </w:t>
+      </w:r>
+      <w:proofErr w:type="spellStart"/>
+      <w:r>
+        <w:rPr>
+          <w:i/>
+          <w:iCs/>
+          <w:lang w:val="es-CO"/>
+        </w:rPr>
+        <w:t>Jose</w:t>
+      </w:r>
+      <w:proofErr w:type="spellEnd"/>
+      <w:r>
+        <w:rPr>
+          <w:i/>
+          <w:iCs/>
+          <w:lang w:val="es-CO"/>
+        </w:rPr>
+        <w:t xml:space="preserve"> </w:t>
+      </w:r>
+      <w:proofErr w:type="spellStart"/>
+      <w:r>
+        <w:rPr>
+          <w:i/>
+          <w:iCs/>
+          <w:lang w:val="es-CO"/>
+        </w:rPr>
+        <w:t>Rincon</w:t>
+      </w:r>
+      <w:proofErr w:type="spellEnd"/>
+      <w:r>
+        <w:rPr>
+          <w:i/>
+          <w:iCs/>
+          <w:lang w:val="es-CO"/>
+        </w:rPr>
+        <w:t xml:space="preserve"> Santos, </w:t>
+      </w:r>
+      <w:hyperlink r:id="rId13" w:history="1">
+        <w:r>
+          <w:rPr>
+            <w:rStyle w:val="Hipervnculo"/>
+            <w:i/>
+            <w:iCs/>
+            <w:lang w:val="es-CO"/>
+          </w:rPr>
+          <w:t>jj.rincons1@uniandes.edu.co</w:t>
+        </w:r>
+      </w:hyperlink>
+      <w:r>
+        <w:rPr>
+          <w:i/>
+          <w:iCs/>
+          <w:lang w:val="es-CO"/>
+        </w:rPr>
+        <w:t>, 202615789</w:t>
       </w:r>
     </w:p>
     <w:p>
@@ -101,7 +225,7 @@
           <w:bCs/>
           <w:lang w:val="es-419"/>
         </w:rPr>
-        <w:t>n</w:t>
+        <w:t>1</w:t>
       </w:r>
       <w:r>
         <w:rPr>
@@ -114,19 +238,6 @@
     </w:p>
     <w:p>
       <w:pPr>
-        <w:rPr>
-          <w:lang w:val="es-419"/>
-        </w:rPr>
-      </w:pPr>
-      <w:r>
-        <w:rPr>
-          <w:lang w:val="es-419"/>
-        </w:rPr>
-        <w:t>Plantilla para el documentar y analizar cada uno de los requerimientos.</w:t>
-      </w:r>
-    </w:p>
-    <w:p>
-      <w:pPr>
         <w:pStyle w:val="Ttulo2"/>
         <w:rPr>
           <w:b/>
@@ -146,27 +257,242 @@
     <w:p>
       <w:pPr>
         <w:rPr>
+          <w:lang w:val="es-CO"/>
+        </w:rPr>
+      </w:pPr>
+      <w:r>
+        <w:rPr>
+          <w:lang w:val="es-CO"/>
+        </w:rPr>
+        <w:drawing>
+          <wp:inline distT="0" distB="0" distL="0" distR="0" wp14:anchorId="0C193DEF" wp14:editId="3041301A">
+            <wp:extent cx="3101340" cy="1851195"/>
+            <wp:effectExtent l="0" t="0" r="3810" b="0"/>
+            <wp:docPr id="1220943040" name="Imagen 1"/>
+            <wp:cNvGraphicFramePr>
+              <a:graphicFrameLocks xmlns:a="http://schemas.openxmlformats.org/drawingml/2006/main" noChangeAspect="1"/>
+            </wp:cNvGraphicFramePr>
+            <a:graphic xmlns:a="http://schemas.openxmlformats.org/drawingml/2006/main">
+              <a:graphicData uri="http://schemas.openxmlformats.org/drawingml/2006/picture">
+                <pic:pic xmlns:pic="http://schemas.openxmlformats.org/drawingml/2006/picture">
+                  <pic:nvPicPr>
+                    <pic:cNvPr id="1220943040" name=""/>
+                    <pic:cNvPicPr/>
+                  </pic:nvPicPr>
+                  <pic:blipFill>
+                    <a:blip r:embed="rId14"/>
+                    <a:stretch>
+                      <a:fillRect/>
+                    </a:stretch>
+                  </pic:blipFill>
+                  <pic:spPr>
+                    <a:xfrm>
+                      <a:off x="0" y="0"/>
+                      <a:ext cx="3104845" cy="1853287"/>
+                    </a:xfrm>
+                    <a:prstGeom prst="rect">
+                      <a:avLst/>
+                    </a:prstGeom>
+                  </pic:spPr>
+                </pic:pic>
+              </a:graphicData>
+            </a:graphic>
+          </wp:inline>
+        </w:drawing>
+      </w:r>
+    </w:p>
+    <w:p>
+      <w:pPr>
+        <w:rPr>
+          <w:lang w:val="es-CO"/>
+        </w:rPr>
+      </w:pPr>
+      <w:r>
+        <w:rPr>
+          <w:lang w:val="es-CO"/>
+        </w:rPr>
+        <w:drawing>
+          <wp:inline distT="0" distB="0" distL="0" distR="0" wp14:anchorId="76F9746B" wp14:editId="61989943">
+            <wp:extent cx="4076700" cy="387635"/>
+            <wp:effectExtent l="0" t="0" r="0" b="0"/>
+            <wp:docPr id="2074188364" name="Imagen 1"/>
+            <wp:cNvGraphicFramePr>
+              <a:graphicFrameLocks xmlns:a="http://schemas.openxmlformats.org/drawingml/2006/main" noChangeAspect="1"/>
+            </wp:cNvGraphicFramePr>
+            <a:graphic xmlns:a="http://schemas.openxmlformats.org/drawingml/2006/main">
+              <a:graphicData uri="http://schemas.openxmlformats.org/drawingml/2006/picture">
+                <pic:pic xmlns:pic="http://schemas.openxmlformats.org/drawingml/2006/picture">
+                  <pic:nvPicPr>
+                    <pic:cNvPr id="2074188364" name=""/>
+                    <pic:cNvPicPr/>
+                  </pic:nvPicPr>
+                  <pic:blipFill>
+                    <a:blip r:embed="rId15"/>
+                    <a:stretch>
+                      <a:fillRect/>
+                    </a:stretch>
+                  </pic:blipFill>
+                  <pic:spPr>
+                    <a:xfrm>
+                      <a:off x="0" y="0"/>
+                      <a:ext cx="4110558" cy="390854"/>
+                    </a:xfrm>
+                    <a:prstGeom prst="rect">
+                      <a:avLst/>
+                    </a:prstGeom>
+                  </pic:spPr>
+                </pic:pic>
+              </a:graphicData>
+            </a:graphic>
+          </wp:inline>
+        </w:drawing>
+      </w:r>
+    </w:p>
+    <w:p>
+      <w:pPr>
+        <w:rPr>
+          <w:lang w:val="es-CO"/>
+        </w:rPr>
+      </w:pPr>
+      <w:r>
+        <w:rPr>
+          <w:lang w:val="es-CO"/>
+        </w:rPr>
+        <w:t xml:space="preserve">Consulta los pedidos de un mes específico cuyo descuento esté dentro de un rango dado, sin recorrer la lista principal. Durante la carga se construye la tabla de hash </w:t>
+      </w:r>
+      <w:proofErr w:type="spellStart"/>
+      <w:r>
+        <w:rPr>
+          <w:lang w:val="es-CO"/>
+        </w:rPr>
+        <w:t>OrdenMes</w:t>
+      </w:r>
+      <w:proofErr w:type="spellEnd"/>
+      <w:r>
+        <w:rPr>
+          <w:lang w:val="es-CO"/>
+        </w:rPr>
+        <w:t xml:space="preserve"> (Linear </w:t>
+      </w:r>
+      <w:proofErr w:type="spellStart"/>
+      <w:r>
+        <w:rPr>
+          <w:lang w:val="es-CO"/>
+        </w:rPr>
+        <w:t>Probing</w:t>
+      </w:r>
+      <w:proofErr w:type="spellEnd"/>
+      <w:r>
+        <w:rPr>
+          <w:lang w:val="es-CO"/>
+        </w:rPr>
+        <w:t xml:space="preserve">), con llave "YYYY-MM" y valor un </w:t>
+      </w:r>
+      <w:proofErr w:type="spellStart"/>
+      <w:r>
+        <w:rPr>
+          <w:lang w:val="es-CO"/>
+        </w:rPr>
+        <w:t>array_list</w:t>
+      </w:r>
+      <w:proofErr w:type="spellEnd"/>
+      <w:r>
+        <w:rPr>
+          <w:lang w:val="es-CO"/>
+        </w:rPr>
+        <w:t xml:space="preserve"> con los pedidos de ese mes. Con el año y el mes recibidos se reconstruye la llave y se accede al mes en una sola operación. Sobre ese subconjunto se filtra por descuento acumulando en el mismo recorrido el monto total, la suma de precios y la suma de cajas, para no hacer pasadas adicionales. Los pedidos que cumplen se guardan en un </w:t>
+      </w:r>
+      <w:proofErr w:type="spellStart"/>
+      <w:r>
+        <w:rPr>
+          <w:lang w:val="es-CO"/>
+        </w:rPr>
+        <w:t>array_list</w:t>
+      </w:r>
+      <w:proofErr w:type="spellEnd"/>
+      <w:r>
+        <w:rPr>
+          <w:lang w:val="es-CO"/>
+        </w:rPr>
+        <w:t xml:space="preserve"> que se ordena con </w:t>
+      </w:r>
+      <w:proofErr w:type="spellStart"/>
+      <w:r>
+        <w:rPr>
+          <w:lang w:val="es-CO"/>
+        </w:rPr>
+        <w:t>Merge</w:t>
+      </w:r>
+      <w:proofErr w:type="spellEnd"/>
+      <w:r>
+        <w:rPr>
+          <w:lang w:val="es-CO"/>
+        </w:rPr>
+        <w:t xml:space="preserve"> </w:t>
+      </w:r>
+      <w:proofErr w:type="spellStart"/>
+      <w:r>
+        <w:rPr>
+          <w:lang w:val="es-CO"/>
+        </w:rPr>
+        <w:t>Sort</w:t>
+      </w:r>
+      <w:proofErr w:type="spellEnd"/>
+      <w:r>
+        <w:rPr>
+          <w:lang w:val="es-CO"/>
+        </w:rPr>
+        <w:t xml:space="preserve">. Si el mes no existe, </w:t>
+      </w:r>
+      <w:proofErr w:type="spellStart"/>
+      <w:r>
+        <w:rPr>
+          <w:lang w:val="es-CO"/>
+        </w:rPr>
+        <w:t>mlp.get</w:t>
+      </w:r>
+      <w:proofErr w:type="spellEnd"/>
+      <w:r>
+        <w:rPr>
+          <w:lang w:val="es-CO"/>
+        </w:rPr>
+        <w:t xml:space="preserve"> retorna </w:t>
+      </w:r>
+      <w:proofErr w:type="spellStart"/>
+      <w:r>
+        <w:rPr>
+          <w:lang w:val="es-CO"/>
+        </w:rPr>
+        <w:t>None</w:t>
+      </w:r>
+      <w:proofErr w:type="spellEnd"/>
+      <w:r>
+        <w:rPr>
+          <w:lang w:val="es-CO"/>
+        </w:rPr>
+        <w:t xml:space="preserve"> y el resultado es vacío sin error.</w:t>
+      </w:r>
+    </w:p>
+    <w:p>
+      <w:pPr>
+        <w:rPr>
           <w:lang w:val="es-419"/>
         </w:rPr>
       </w:pPr>
-      <w:r>
+    </w:p>
+    <w:p>
+      <w:pPr>
         <w:rPr>
           <w:lang w:val="es-419"/>
         </w:rPr>
-        <w:t xml:space="preserve">Breve </w:t>
-      </w:r>
-      <w:r>
+      </w:pPr>
+    </w:p>
+    <w:p>
+      <w:pPr>
         <w:rPr>
           <w:lang w:val="es-419"/>
         </w:rPr>
-        <w:t>descripción</w:t>
-      </w:r>
-      <w:r>
-        <w:rPr>
-          <w:lang w:val="es-419"/>
-        </w:rPr>
-        <w:t xml:space="preserve"> de como abordaron la implementación del requerimiento</w:t>
-      </w:r>
+      </w:pPr>
     </w:p>
     <w:tbl>
       <w:tblPr>
@@ -217,21 +543,34 @@
           <w:p>
             <w:pPr>
               <w:rPr>
-                <w:lang w:val="es-419"/>
+                <w:lang w:val="es-CO"/>
               </w:rPr>
             </w:pPr>
             <w:r>
               <w:rPr>
-                <w:lang w:val="es-419"/>
-              </w:rPr>
-              <w:t>Parámetros</w:t>
+                <w:lang w:val="es-CO"/>
+              </w:rPr>
+              <w:t xml:space="preserve">catalog, anio, mes, </w:t>
             </w:r>
             <w:r>
               <w:rPr>
+                <w:lang w:val="es-CO"/>
+              </w:rPr>
+              <w:t>descuento min</w:t>
+            </w:r>
+            <w:r>
+              <w:rPr>
+                <w:lang w:val="es-CO"/>
+              </w:rPr>
+              <w:t>, descuento_max</w:t>
+            </w:r>
+          </w:p>
+          <w:p>
+            <w:pPr>
+              <w:rPr>
                 <w:lang w:val="es-419"/>
               </w:rPr>
-              <w:t xml:space="preserve"> necesarios para resolver el requerimiento.</w:t>
-            </w:r>
+            </w:pPr>
           </w:p>
         </w:tc>
       </w:tr>
@@ -273,15 +612,70 @@
           <w:p>
             <w:pPr>
               <w:rPr>
-                <w:lang w:val="es-419"/>
+                <w:lang w:val="es-CO"/>
               </w:rPr>
             </w:pPr>
             <w:r>
               <w:rPr>
+                <w:lang w:val="es-CO"/>
+              </w:rPr>
+              <w:t xml:space="preserve">tiempo, </w:t>
+            </w:r>
+            <w:r>
+              <w:rPr>
+                <w:lang w:val="es-CO"/>
+              </w:rPr>
+              <w:t>total pedidos</w:t>
+            </w:r>
+            <w:r>
+              <w:rPr>
+                <w:lang w:val="es-CO"/>
+              </w:rPr>
+              <w:t>, total_amount</w:t>
+            </w:r>
+            <w:r>
+              <w:rPr>
+                <w:lang w:val="es-CO"/>
+              </w:rPr>
+              <w:t xml:space="preserve">, </w:t>
+            </w:r>
+            <w:r>
+              <w:rPr>
+                <w:lang w:val="es-CO"/>
+              </w:rPr>
+              <w:t>promedio precio</w:t>
+            </w:r>
+            <w:r>
+              <w:rPr>
+                <w:lang w:val="es-CO"/>
+              </w:rPr>
+              <w:t xml:space="preserve">, </w:t>
+            </w:r>
+            <w:r>
+              <w:rPr>
+                <w:lang w:val="es-CO"/>
+              </w:rPr>
+              <w:t>promedio cajas</w:t>
+            </w:r>
+            <w:r>
+              <w:rPr>
+                <w:lang w:val="es-CO"/>
+              </w:rPr>
+              <w:t>, filtrados</w:t>
+            </w:r>
+            <w:r>
+              <w:rPr>
+                <w:lang w:val="es-CO"/>
+              </w:rPr>
+              <w:t>.</w:t>
+            </w:r>
+          </w:p>
+          <w:p>
+            <w:pPr>
+              <w:rPr>
                 <w:lang w:val="es-419"/>
               </w:rPr>
-              <w:t>Respuesta esperada del algoritmo.</w:t>
-            </w:r>
+            </w:pPr>
           </w:p>
         </w:tc>
       </w:tr>
@@ -322,19 +716,7 @@
               <w:rPr>
                 <w:lang w:val="es-419"/>
               </w:rPr>
-              <w:t xml:space="preserve">Si se </w:t>
-            </w:r>
-            <w:r>
-              <w:rPr>
-                <w:lang w:val="es-419"/>
-              </w:rPr>
-              <w:t>implementó</w:t>
-            </w:r>
-            <w:r>
-              <w:rPr>
-                <w:lang w:val="es-419"/>
-              </w:rPr>
-              <w:t xml:space="preserve"> y quien lo hizo.</w:t>
+              <w:t>Implementado por Juan Rojas</w:t>
             </w:r>
           </w:p>
         </w:tc>
@@ -455,14 +837,14 @@
           <w:p>
             <w:pPr>
               <w:rPr>
-                <w:lang w:val="es-419"/>
+                <w:lang w:val="es-CO"/>
               </w:rPr>
             </w:pPr>
             <w:r>
               <w:rPr>
-                <w:lang w:val="es-419"/>
-              </w:rPr>
-              <w:t>Paso 1</w:t>
+                <w:lang w:val="es-CO"/>
+              </w:rPr>
+              <w:t>Construir la llave "YYYY-MM" a partir del año y el mes</w:t>
             </w:r>
           </w:p>
         </w:tc>
@@ -476,640 +858,19 @@
                 <w:lang w:val="es-419"/>
               </w:rPr>
             </w:pPr>
-            <w:r>
-              <w:rPr>
-                <w:lang w:val="es-419"/>
-              </w:rPr>
-              <w:t>O(...)</w:t>
-            </w:r>
-          </w:p>
-        </w:tc>
-      </w:tr>
-      <w:tr>
-        <w:tc>
-          <w:tcPr>
-            <w:tcW w:w="5070" w:type="dxa"/>
-          </w:tcPr>
-          <w:p>
-            <w:pPr>
-              <w:rPr>
-                <w:lang w:val="es-419"/>
-              </w:rPr>
-            </w:pPr>
-            <w:r>
-              <w:rPr>
-                <w:lang w:val="es-419"/>
-              </w:rPr>
-              <w:t xml:space="preserve">Paso 2 </w:t>
-            </w:r>
-          </w:p>
-        </w:tc>
-        <w:tc>
-          <w:tcPr>
-            <w:tcW w:w="4275" w:type="dxa"/>
-          </w:tcPr>
-          <w:p>
-            <w:pPr>
-              <w:rPr>
-                <w:lang w:val="es-419"/>
-              </w:rPr>
-            </w:pPr>
-            <w:r>
-              <w:rPr>
-                <w:lang w:val="es-419"/>
-              </w:rPr>
-              <w:t>O(...)</w:t>
-            </w:r>
-          </w:p>
-        </w:tc>
-      </w:tr>
-      <w:tr>
-        <w:tc>
-          <w:tcPr>
-            <w:tcW w:w="5070" w:type="dxa"/>
-          </w:tcPr>
-          <w:p>
-            <w:pPr>
-              <w:rPr>
-                <w:lang w:val="es-419"/>
-              </w:rPr>
-            </w:pPr>
-            <w:r>
-              <w:rPr>
-                <w:lang w:val="es-419"/>
-              </w:rPr>
-              <w:t>Paso ….</w:t>
-            </w:r>
-          </w:p>
-        </w:tc>
-        <w:tc>
-          <w:tcPr>
-            <w:tcW w:w="4275" w:type="dxa"/>
-          </w:tcPr>
-          <w:p>
-            <w:pPr>
-              <w:rPr>
-                <w:lang w:val="es-419"/>
-              </w:rPr>
-            </w:pPr>
-            <w:r>
-              <w:rPr>
-                <w:lang w:val="es-419"/>
-              </w:rPr>
-              <w:t>O(...)</w:t>
-            </w:r>
-          </w:p>
-        </w:tc>
-      </w:tr>
-      <w:tr>
-        <w:tc>
-          <w:tcPr>
-            <w:tcW w:w="5070" w:type="dxa"/>
-          </w:tcPr>
-          <w:p>
-            <w:pPr>
-              <w:rPr>
-                <w:b/>
-                <w:bCs/>
-                <w:i/>
-                <w:iCs/>
-                <w:lang w:val="es-419"/>
-              </w:rPr>
-            </w:pPr>
-            <w:r>
-              <w:rPr>
-                <w:b/>
-                <w:bCs/>
-                <w:i/>
-                <w:iCs/>
-                <w:lang w:val="es-419"/>
-              </w:rPr>
-              <w:t>TOTAL</w:t>
-            </w:r>
-          </w:p>
-        </w:tc>
-        <w:tc>
-          <w:tcPr>
-            <w:tcW w:w="4275" w:type="dxa"/>
-          </w:tcPr>
-          <w:p>
-            <w:pPr>
-              <w:rPr>
-                <w:b/>
-                <w:bCs/>
-                <w:i/>
-                <w:iCs/>
-                <w:lang w:val="es-419"/>
-              </w:rPr>
-            </w:pPr>
-            <w:r>
-              <w:rPr>
-                <w:b/>
-                <w:bCs/>
-                <w:i/>
-                <w:iCs/>
-                <w:lang w:val="es-419"/>
-              </w:rPr>
-              <w:t>O(...)</w:t>
-            </w:r>
-          </w:p>
-        </w:tc>
-      </w:tr>
-    </w:tbl>
-    <w:p>
-      <w:pPr>
-        <w:rPr>
-          <w:rFonts w:ascii="Dax-Regular" w:hAnsi="Dax-Regular"/>
-          <w:lang w:val="es-419"/>
-        </w:rPr>
-      </w:pPr>
-    </w:p>
-    <w:p>
-      <w:pPr>
-        <w:pStyle w:val="Ttulo2"/>
-        <w:rPr>
-          <w:b/>
-          <w:bCs/>
-          <w:lang w:val="es-419"/>
-        </w:rPr>
-      </w:pPr>
-      <w:r>
-        <w:rPr>
-          <w:b/>
-          <w:bCs/>
-          <w:lang w:val="es-419"/>
-        </w:rPr>
-        <w:t>Análisis</w:t>
-      </w:r>
-    </w:p>
-    <w:p>
-      <w:pPr>
-        <w:rPr>
-          <w:lang w:val="es-419"/>
-        </w:rPr>
-      </w:pPr>
-      <w:r>
-        <w:rPr>
-          <w:lang w:val="es-419"/>
-        </w:rPr>
-        <w:t>Análisis de resultados de la implementación, tener cuenta las pruebas realizadas y el analisis de complejidad.</w:t>
-      </w:r>
-    </w:p>
-    <w:p>
-      <w:pPr>
-        <w:pStyle w:val="Ttulo1"/>
-        <w:rPr>
-          <w:b/>
-          <w:bCs/>
-          <w:lang w:val="es-419"/>
-        </w:rPr>
-      </w:pPr>
-      <w:r>
-        <w:rPr>
-          <w:b/>
-          <w:bCs/>
-          <w:lang w:val="es-419"/>
-        </w:rPr>
-        <w:t xml:space="preserve">Requerimiento </w:t>
-      </w:r>
-      <w:r>
-        <w:rPr>
-          <w:b/>
-          <w:bCs/>
-          <w:lang w:val="es-419"/>
-        </w:rPr>
-        <w:t>Ejemplo</w:t>
-      </w:r>
-    </w:p>
-    <w:p>
-      <w:pPr>
-        <w:rPr>
-          <w:lang w:val="es-419"/>
-        </w:rPr>
-      </w:pPr>
-    </w:p>
-    <w:p>
-      <w:pPr>
-        <w:pStyle w:val="Ttulo2"/>
-        <w:rPr>
-          <w:b/>
-          <w:bCs/>
-          <w:lang w:val="es-419"/>
-        </w:rPr>
-      </w:pPr>
-      <w:r>
-        <w:rPr>
-          <w:b/>
-          <w:bCs/>
-          <w:lang w:val="es-419"/>
-        </w:rPr>
-        <w:lastRenderedPageBreak/>
-        <w:t>Descripción</w:t>
-      </w:r>
-    </w:p>
-    <w:p>
-      <w:pPr>
-        <w:ind w:left="1440" w:hanging="1440"/>
-        <w:jc w:val="center"/>
-        <w:rPr>
-          <w:lang w:val="es-419"/>
-        </w:rPr>
-      </w:pPr>
-      <w:r>
-        <w:rPr>
-          <w:noProof/>
-          <w:lang w:val="es-419"/>
-        </w:rPr>
-        <w:drawing>
-          <wp:inline distT="0" distB="0" distL="0" distR="0" wp14:anchorId="35ECC59E" wp14:editId="0A0A9058">
-            <wp:extent cx="3547872" cy="1385413"/>
-            <wp:effectExtent l="0" t="0" r="0" b="5715"/>
-            <wp:docPr id="1" name="Picture 1"/>
-            <wp:cNvGraphicFramePr>
-              <a:graphicFrameLocks xmlns:a="http://schemas.openxmlformats.org/drawingml/2006/main" noChangeAspect="1"/>
-            </wp:cNvGraphicFramePr>
-            <a:graphic xmlns:a="http://schemas.openxmlformats.org/drawingml/2006/main">
-              <a:graphicData uri="http://schemas.openxmlformats.org/drawingml/2006/picture">
-                <pic:pic xmlns:pic="http://schemas.openxmlformats.org/drawingml/2006/picture">
-                  <pic:nvPicPr>
-                    <pic:cNvPr id="1" name=""/>
-                    <pic:cNvPicPr/>
-                  </pic:nvPicPr>
-                  <pic:blipFill>
-                    <a:blip r:embed="rId11"/>
-                    <a:stretch>
-                      <a:fillRect/>
-                    </a:stretch>
-                  </pic:blipFill>
-                  <pic:spPr>
-                    <a:xfrm>
-                      <a:off x="0" y="0"/>
-                      <a:ext cx="3585430" cy="1400079"/>
-                    </a:xfrm>
-                    <a:prstGeom prst="rect">
-                      <a:avLst/>
-                    </a:prstGeom>
-                  </pic:spPr>
-                </pic:pic>
-              </a:graphicData>
-            </a:graphic>
-          </wp:inline>
-        </w:drawing>
-      </w:r>
-    </w:p>
-    <w:p>
-      <w:pPr>
-        <w:spacing w:line="276" w:lineRule="auto"/>
-        <w:rPr>
-          <w:lang w:val="es-419"/>
-        </w:rPr>
-      </w:pPr>
-      <w:r>
-        <w:rPr>
-          <w:lang w:val="es-419"/>
-        </w:rPr>
-        <w:t>Este requerimiento se encarga de retornar un dato de una lista dado su ID. Lo primero que hace es verificar si el elemento existe. Dado el caso que exista</w:t>
-      </w:r>
-      <w:r>
-        <w:rPr>
-          <w:lang w:val="es-419"/>
-        </w:rPr>
-        <w:t>, retorna su posición,</w:t>
-      </w:r>
-      <w:r>
-        <w:rPr>
-          <w:lang w:val="es-419"/>
-        </w:rPr>
-        <w:t xml:space="preserve"> lo busca en la lista y lo retorna</w:t>
-      </w:r>
-      <w:r>
-        <w:rPr>
-          <w:lang w:val="es-419"/>
-        </w:rPr>
-        <w:t>.</w:t>
-      </w:r>
-      <w:r>
-        <w:rPr>
-          <w:lang w:val="es-419"/>
-        </w:rPr>
-        <w:t xml:space="preserve"> </w:t>
-      </w:r>
-      <w:r>
-        <w:rPr>
-          <w:lang w:val="es-419"/>
-        </w:rPr>
-        <w:t>D</w:t>
-      </w:r>
-      <w:r>
-        <w:rPr>
-          <w:lang w:val="es-419"/>
-        </w:rPr>
-        <w:t>e lo contrario</w:t>
-      </w:r>
-      <w:r>
-        <w:rPr>
-          <w:lang w:val="es-419"/>
-        </w:rPr>
-        <w:t>,</w:t>
-      </w:r>
-      <w:r>
-        <w:rPr>
-          <w:lang w:val="es-419"/>
-        </w:rPr>
-        <w:t xml:space="preserve"> retorna None.</w:t>
-      </w:r>
-    </w:p>
-    <w:tbl>
-      <w:tblPr>
-        <w:tblStyle w:val="Tablaconcuadrcula"/>
-        <w:tblW w:w="9360" w:type="dxa"/>
-        <w:tblLayout w:type="fixed"/>
-        <w:tblLook w:val="06A0" w:firstRow="1" w:lastRow="0" w:firstColumn="1" w:lastColumn="0" w:noHBand="1" w:noVBand="1"/>
-      </w:tblPr>
-      <w:tblGrid>
-        <w:gridCol w:w="3060"/>
-        <w:gridCol w:w="6300"/>
-      </w:tblGrid>
-      <w:tr>
-        <w:tc>
-          <w:tcPr>
-            <w:tcW w:w="3060" w:type="dxa"/>
-          </w:tcPr>
-          <w:p>
-            <w:pPr>
-              <w:rPr>
-                <w:b/>
-                <w:bCs/>
-                <w:lang w:val="es-419"/>
-              </w:rPr>
-            </w:pPr>
-            <w:r>
-              <w:rPr>
-                <w:b/>
-                <w:bCs/>
-                <w:lang w:val="es-419"/>
-              </w:rPr>
-              <w:t xml:space="preserve">Entrada </w:t>
-            </w:r>
-          </w:p>
-        </w:tc>
-        <w:tc>
-          <w:tcPr>
-            <w:tcW w:w="6300" w:type="dxa"/>
-          </w:tcPr>
-          <w:p>
-            <w:pPr>
-              <w:rPr>
-                <w:lang w:val="es-419"/>
-              </w:rPr>
-            </w:pPr>
-            <w:r>
-              <w:rPr>
-                <w:lang w:val="es-419"/>
-              </w:rPr>
-              <w:t>Estructuras de datos del modelo</w:t>
-            </w:r>
-            <w:r>
-              <w:rPr>
-                <w:lang w:val="es-419"/>
-              </w:rPr>
-              <w:t>, ID.</w:t>
-            </w:r>
-          </w:p>
-        </w:tc>
-      </w:tr>
-      <w:tr>
-        <w:tc>
-          <w:tcPr>
-            <w:tcW w:w="3060" w:type="dxa"/>
-          </w:tcPr>
-          <w:p>
-            <w:pPr>
-              <w:rPr>
-                <w:b/>
-                <w:bCs/>
-                <w:lang w:val="es-419"/>
-              </w:rPr>
-            </w:pPr>
-            <w:r>
-              <w:rPr>
-                <w:b/>
-                <w:bCs/>
-                <w:lang w:val="es-419"/>
-              </w:rPr>
-              <w:t>Salidas</w:t>
-            </w:r>
-          </w:p>
-        </w:tc>
-        <w:tc>
-          <w:tcPr>
-            <w:tcW w:w="6300" w:type="dxa"/>
-          </w:tcPr>
-          <w:p>
-            <w:pPr>
-              <w:rPr>
-                <w:lang w:val="es-419"/>
-              </w:rPr>
-            </w:pPr>
-            <w:r>
-              <w:rPr>
-                <w:lang w:val="es-419"/>
-              </w:rPr>
-              <w:t>El elemento con el ID dado, si no existe se retorna None</w:t>
-            </w:r>
-          </w:p>
-        </w:tc>
-      </w:tr>
-      <w:tr>
-        <w:tc>
-          <w:tcPr>
-            <w:tcW w:w="3060" w:type="dxa"/>
-          </w:tcPr>
-          <w:p>
-            <w:pPr>
-              <w:rPr>
-                <w:b/>
-                <w:bCs/>
-                <w:lang w:val="es-419"/>
-              </w:rPr>
-            </w:pPr>
-            <w:r>
-              <w:rPr>
-                <w:b/>
-                <w:bCs/>
-                <w:lang w:val="es-419"/>
-              </w:rPr>
-              <w:t>Implementado (Sí/No)</w:t>
-            </w:r>
-          </w:p>
-        </w:tc>
-        <w:tc>
-          <w:tcPr>
-            <w:tcW w:w="6300" w:type="dxa"/>
-          </w:tcPr>
-          <w:p>
-            <w:pPr>
-              <w:rPr>
-                <w:lang w:val="es-419"/>
-              </w:rPr>
-            </w:pPr>
-            <w:r>
-              <w:rPr>
-                <w:lang w:val="es-419"/>
-              </w:rPr>
-              <w:t>Si</w:t>
-            </w:r>
-            <w:r>
-              <w:rPr>
-                <w:lang w:val="es-419"/>
-              </w:rPr>
-              <w:t xml:space="preserve">. Implementado por Juan </w:t>
-            </w:r>
-            <w:r>
-              <w:rPr>
-                <w:lang w:val="es-419"/>
-              </w:rPr>
-              <w:t>Andrés Ariza</w:t>
-            </w:r>
-          </w:p>
-        </w:tc>
-      </w:tr>
-    </w:tbl>
-    <w:p>
-      <w:pPr>
-        <w:rPr>
-          <w:lang w:val="es-419"/>
-        </w:rPr>
-      </w:pPr>
-    </w:p>
-    <w:p>
-      <w:pPr>
-        <w:pStyle w:val="Ttulo2"/>
-        <w:rPr>
-          <w:b/>
-          <w:bCs/>
-          <w:lang w:val="es-419"/>
-        </w:rPr>
-      </w:pPr>
-      <w:r>
-        <w:rPr>
-          <w:b/>
-          <w:bCs/>
-          <w:lang w:val="es-419"/>
-        </w:rPr>
-        <w:t>Análisis de complejidad</w:t>
-      </w:r>
-    </w:p>
-    <w:p>
-      <w:pPr>
-        <w:rPr>
-          <w:lang w:val="es-419"/>
-        </w:rPr>
-      </w:pPr>
-      <w:r>
-        <w:rPr>
-          <w:lang w:val="es-419"/>
-        </w:rPr>
-        <w:t>Análisis de complejidad de cada uno de los pasos del algoritmo</w:t>
-      </w:r>
-    </w:p>
-    <w:tbl>
-      <w:tblPr>
-        <w:tblStyle w:val="Tablaconcuadrcula"/>
-        <w:tblW w:w="0" w:type="auto"/>
-        <w:tblLayout w:type="fixed"/>
-        <w:tblLook w:val="06A0" w:firstRow="1" w:lastRow="0" w:firstColumn="1" w:lastColumn="0" w:noHBand="1" w:noVBand="1"/>
-      </w:tblPr>
-      <w:tblGrid>
-        <w:gridCol w:w="5070"/>
-        <w:gridCol w:w="4275"/>
-      </w:tblGrid>
-      <w:tr>
-        <w:tc>
-          <w:tcPr>
-            <w:tcW w:w="5070" w:type="dxa"/>
-          </w:tcPr>
-          <w:p>
-            <w:pPr>
-              <w:rPr>
-                <w:b/>
-                <w:bCs/>
-                <w:lang w:val="es-419"/>
-              </w:rPr>
-            </w:pPr>
-            <w:r>
-              <w:rPr>
-                <w:b/>
-                <w:bCs/>
-                <w:lang w:val="es-419"/>
-              </w:rPr>
-              <w:t>Pasos</w:t>
-            </w:r>
-          </w:p>
-        </w:tc>
-        <w:tc>
-          <w:tcPr>
-            <w:tcW w:w="4275" w:type="dxa"/>
-          </w:tcPr>
-          <w:p>
-            <w:pPr>
-              <w:rPr>
-                <w:b/>
-                <w:bCs/>
-                <w:lang w:val="es-419"/>
-              </w:rPr>
-            </w:pPr>
-            <w:r>
-              <w:rPr>
-                <w:b/>
-                <w:bCs/>
-                <w:lang w:val="es-419"/>
-              </w:rPr>
-              <w:t>Complejidad</w:t>
-            </w:r>
-          </w:p>
-        </w:tc>
-      </w:tr>
-      <w:tr>
-        <w:tc>
-          <w:tcPr>
-            <w:tcW w:w="5070" w:type="dxa"/>
-          </w:tcPr>
-          <w:p>
-            <w:pPr>
-              <w:rPr>
-                <w:lang w:val="es-419"/>
-              </w:rPr>
-            </w:pPr>
-            <w:r>
-              <w:rPr>
-                <w:lang w:val="es-419"/>
-              </w:rPr>
-              <w:t>Buscar si el elemento existe (isPresent)</w:t>
-            </w:r>
-          </w:p>
-        </w:tc>
-        <w:tc>
-          <w:tcPr>
-            <w:tcW w:w="4275" w:type="dxa"/>
-          </w:tcPr>
-          <w:p>
-            <w:pPr>
-              <w:rPr>
-                <w:lang w:val="es-419"/>
-              </w:rPr>
-            </w:pPr>
+            <w:proofErr w:type="gramStart"/>
             <w:r>
               <w:rPr>
                 <w:lang w:val="es-419"/>
               </w:rPr>
               <w:t>O(</w:t>
             </w:r>
+            <w:proofErr w:type="gramEnd"/>
             <w:r>
               <w:rPr>
                 <w:lang w:val="es-419"/>
               </w:rPr>
-              <w:t>n</w:t>
+              <w:t>1</w:t>
             </w:r>
             <w:r>
               <w:rPr>
@@ -1128,20 +889,56 @@
           <w:p>
             <w:pPr>
               <w:rPr>
-                <w:lang w:val="es-419"/>
+                <w:lang w:val="es-CO"/>
               </w:rPr>
             </w:pPr>
             <w:r>
               <w:rPr>
-                <w:lang w:val="es-419"/>
-              </w:rPr>
-              <w:t>Obtener el elemento (getElement)</w:t>
+                <w:lang w:val="es-CO"/>
+              </w:rPr>
+              <w:t>Buscar la llave en la tabla de hash </w:t>
             </w:r>
+            <w:proofErr w:type="spellStart"/>
             <w:r>
               <w:rPr>
-                <w:lang w:val="es-419"/>
-              </w:rPr>
-              <w:t xml:space="preserve"> </w:t>
+                <w:lang w:val="es-CO"/>
+              </w:rPr>
+              <w:t>OrdenMes</w:t>
+            </w:r>
+            <w:proofErr w:type="spellEnd"/>
+            <w:r>
+              <w:rPr>
+                <w:lang w:val="es-CO"/>
+              </w:rPr>
+              <w:t> (</w:t>
+            </w:r>
+            <w:proofErr w:type="spellStart"/>
+            <w:r>
+              <w:rPr>
+                <w:lang w:val="es-CO"/>
+              </w:rPr>
+              <w:t>mlp.get</w:t>
+            </w:r>
+            <w:proofErr w:type="spellEnd"/>
+            <w:r>
+              <w:rPr>
+                <w:lang w:val="es-CO"/>
+              </w:rPr>
+              <w:t xml:space="preserve">, Linear </w:t>
+            </w:r>
+            <w:proofErr w:type="spellStart"/>
+            <w:r>
+              <w:rPr>
+                <w:lang w:val="es-CO"/>
+              </w:rPr>
+              <w:t>Probing</w:t>
+            </w:r>
+            <w:proofErr w:type="spellEnd"/>
+            <w:r>
+              <w:rPr>
+                <w:lang w:val="es-CO"/>
+              </w:rPr>
+              <w:t>)</w:t>
             </w:r>
           </w:p>
         </w:tc>
@@ -1155,12 +952,178 @@
                 <w:lang w:val="es-419"/>
               </w:rPr>
             </w:pPr>
+            <w:proofErr w:type="gramStart"/>
             <w:r>
               <w:rPr>
                 <w:lang w:val="es-419"/>
               </w:rPr>
               <w:t>O(</w:t>
             </w:r>
+            <w:proofErr w:type="gramEnd"/>
+            <w:r>
+              <w:rPr>
+                <w:lang w:val="es-419"/>
+              </w:rPr>
+              <w:t>1</w:t>
+            </w:r>
+            <w:r>
+              <w:rPr>
+                <w:lang w:val="es-419"/>
+              </w:rPr>
+              <w:t>)</w:t>
+            </w:r>
+            <w:r>
+              <w:rPr>
+                <w:lang w:val="es-419"/>
+              </w:rPr>
+              <w:t xml:space="preserve"> promedio </w:t>
+            </w:r>
+          </w:p>
+        </w:tc>
+      </w:tr>
+      <w:tr>
+        <w:tc>
+          <w:tcPr>
+            <w:tcW w:w="5070" w:type="dxa"/>
+          </w:tcPr>
+          <w:p>
+            <w:pPr>
+              <w:rPr>
+                <w:lang w:val="es-CO"/>
+              </w:rPr>
+            </w:pPr>
+            <w:r>
+              <w:rPr>
+                <w:lang w:val="es-CO"/>
+              </w:rPr>
+              <w:t>Recorrer los m pedidos del mes y filtrar por el rango de descuento, acumulando monto total, suma de precios y suma de cajas </w:t>
+            </w:r>
+          </w:p>
+        </w:tc>
+        <w:tc>
+          <w:tcPr>
+            <w:tcW w:w="4275" w:type="dxa"/>
+          </w:tcPr>
+          <w:p>
+            <w:pPr>
+              <w:rPr>
+                <w:lang w:val="es-419"/>
+              </w:rPr>
+            </w:pPr>
+            <w:r>
+              <w:rPr>
+                <w:lang w:val="es-419"/>
+              </w:rPr>
+              <w:t>O(m)</w:t>
+            </w:r>
+          </w:p>
+        </w:tc>
+      </w:tr>
+      <w:tr>
+        <w:tc>
+          <w:tcPr>
+            <w:tcW w:w="5070" w:type="dxa"/>
+          </w:tcPr>
+          <w:p>
+            <w:pPr>
+              <w:rPr>
+                <w:lang w:val="es-CO"/>
+              </w:rPr>
+            </w:pPr>
+            <w:r>
+              <w:rPr>
+                <w:lang w:val="es-CO"/>
+              </w:rPr>
+              <w:t xml:space="preserve">Ordenar los k pedidos filtrados con </w:t>
+            </w:r>
+            <w:proofErr w:type="spellStart"/>
+            <w:r>
+              <w:rPr>
+                <w:lang w:val="es-CO"/>
+              </w:rPr>
+              <w:t>Merge</w:t>
+            </w:r>
+            <w:proofErr w:type="spellEnd"/>
+            <w:r>
+              <w:rPr>
+                <w:lang w:val="es-CO"/>
+              </w:rPr>
+              <w:t xml:space="preserve"> </w:t>
+            </w:r>
+            <w:proofErr w:type="spellStart"/>
+            <w:r>
+              <w:rPr>
+                <w:lang w:val="es-CO"/>
+              </w:rPr>
+              <w:t>Sort</w:t>
+            </w:r>
+            <w:proofErr w:type="spellEnd"/>
+          </w:p>
+        </w:tc>
+        <w:tc>
+          <w:tcPr>
+            <w:tcW w:w="4275" w:type="dxa"/>
+          </w:tcPr>
+          <w:p>
+            <w:pPr>
+              <w:rPr>
+                <w:lang w:val="es-419"/>
+              </w:rPr>
+            </w:pPr>
+            <w:proofErr w:type="gramStart"/>
+            <w:r>
+              <w:rPr>
+                <w:lang w:val="es-419"/>
+              </w:rPr>
+              <w:t>O(</w:t>
+            </w:r>
+            <w:proofErr w:type="gramEnd"/>
+            <w:r>
+              <w:rPr>
+                <w:lang w:val="es-419"/>
+              </w:rPr>
+              <w:t>k log k)</w:t>
+            </w:r>
+          </w:p>
+        </w:tc>
+      </w:tr>
+      <w:tr>
+        <w:tc>
+          <w:tcPr>
+            <w:tcW w:w="5070" w:type="dxa"/>
+          </w:tcPr>
+          <w:p>
+            <w:pPr>
+              <w:rPr>
+                <w:lang w:val="es-CO"/>
+              </w:rPr>
+            </w:pPr>
+            <w:r>
+              <w:rPr>
+                <w:lang w:val="es-CO"/>
+              </w:rPr>
+              <w:t>Calcular los dos promedios a partir de los acumuladores</w:t>
+            </w:r>
+          </w:p>
+        </w:tc>
+        <w:tc>
+          <w:tcPr>
+            <w:tcW w:w="4275" w:type="dxa"/>
+          </w:tcPr>
+          <w:p>
+            <w:pPr>
+              <w:rPr>
+                <w:lang w:val="es-419"/>
+              </w:rPr>
+            </w:pPr>
+            <w:proofErr w:type="gramStart"/>
+            <w:r>
+              <w:rPr>
+                <w:lang w:val="es-419"/>
+              </w:rPr>
+              <w:t>O(</w:t>
+            </w:r>
+            <w:proofErr w:type="gramEnd"/>
             <w:r>
               <w:rPr>
                 <w:lang w:val="es-419"/>
@@ -1217,6 +1180,7 @@
                 <w:lang w:val="es-419"/>
               </w:rPr>
             </w:pPr>
+            <w:proofErr w:type="gramStart"/>
             <w:r>
               <w:rPr>
                 <w:b/>
@@ -1227,6 +1191,7 @@
               </w:rPr>
               <w:t>O(</w:t>
             </w:r>
+            <w:proofErr w:type="gramEnd"/>
             <w:r>
               <w:rPr>
                 <w:b/>
@@ -1235,7 +1200,27 @@
                 <w:iCs/>
                 <w:lang w:val="es-419"/>
               </w:rPr>
-              <w:t>n</w:t>
+              <w:t xml:space="preserve">m + </w:t>
+            </w:r>
+            <w:r>
+              <w:rPr>
+                <w:b/>
+                <w:bCs/>
+                <w:i/>
+                <w:iCs/>
+                <w:lang w:val="es-419"/>
+              </w:rPr>
+              <w:t xml:space="preserve">k </w:t>
+            </w:r>
+            <w:r>
+              <w:rPr>
+                <w:b/>
+                <w:bCs/>
+                <w:i/>
+                <w:iCs/>
+                <w:lang w:val="es-419"/>
+              </w:rPr>
+              <w:t>log k</w:t>
             </w:r>
             <w:r>
               <w:rPr>
@@ -1279,161 +1264,223 @@
     </w:p>
     <w:p>
       <w:pPr>
+        <w:pStyle w:val="Ttulo1"/>
+        <w:rPr>
+          <w:rFonts w:asciiTheme="minorHAnsi" w:eastAsiaTheme="minorEastAsia" w:hAnsiTheme="minorHAnsi" w:cstheme="minorBidi"/>
+          <w:color w:val="auto"/>
+          <w:sz w:val="22"/>
+          <w:szCs w:val="22"/>
+          <w:lang w:val="es-CO"/>
+        </w:rPr>
+      </w:pPr>
+      <w:r>
+        <w:rPr>
+          <w:rFonts w:asciiTheme="minorHAnsi" w:eastAsiaTheme="minorEastAsia" w:hAnsiTheme="minorHAnsi" w:cstheme="minorBidi"/>
+          <w:color w:val="auto"/>
+          <w:sz w:val="22"/>
+          <w:szCs w:val="22"/>
+          <w:lang w:val="es-CO"/>
+        </w:rPr>
+        <w:t xml:space="preserve">Indexar por mes evita recorrer los 193.608 pedidos: cada mes </w:t>
+      </w:r>
+      <w:r>
+        <w:rPr>
+          <w:rFonts w:asciiTheme="minorHAnsi" w:eastAsiaTheme="minorEastAsia" w:hAnsiTheme="minorHAnsi" w:cstheme="minorBidi"/>
+          <w:color w:val="auto"/>
+          <w:sz w:val="22"/>
+          <w:szCs w:val="22"/>
+          <w:lang w:val="es-CO"/>
+        </w:rPr>
+        <w:t xml:space="preserve">hay aproximadamente </w:t>
+      </w:r>
+      <w:r>
+        <w:rPr>
+          <w:rFonts w:asciiTheme="minorHAnsi" w:eastAsiaTheme="minorEastAsia" w:hAnsiTheme="minorHAnsi" w:cstheme="minorBidi"/>
+          <w:color w:val="auto"/>
+          <w:sz w:val="22"/>
+          <w:szCs w:val="22"/>
+          <w:lang w:val="es-CO"/>
+        </w:rPr>
+        <w:t xml:space="preserve">8.000 registros y la búsqueda es </w:t>
+      </w:r>
+      <w:proofErr w:type="gramStart"/>
+      <w:r>
+        <w:rPr>
+          <w:rFonts w:asciiTheme="minorHAnsi" w:eastAsiaTheme="minorEastAsia" w:hAnsiTheme="minorHAnsi" w:cstheme="minorBidi"/>
+          <w:color w:val="auto"/>
+          <w:sz w:val="22"/>
+          <w:szCs w:val="22"/>
+          <w:lang w:val="es-CO"/>
+        </w:rPr>
+        <w:t>O(</w:t>
+      </w:r>
+      <w:proofErr w:type="gramEnd"/>
+      <w:r>
+        <w:rPr>
+          <w:rFonts w:asciiTheme="minorHAnsi" w:eastAsiaTheme="minorEastAsia" w:hAnsiTheme="minorHAnsi" w:cstheme="minorBidi"/>
+          <w:color w:val="auto"/>
+          <w:sz w:val="22"/>
+          <w:szCs w:val="22"/>
+          <w:lang w:val="es-CO"/>
+        </w:rPr>
+        <w:t xml:space="preserve">1), así que el costo depende del tamaño del mes y del resultado, no del archivo. Se usó Linear </w:t>
+      </w:r>
+      <w:proofErr w:type="spellStart"/>
+      <w:r>
+        <w:rPr>
+          <w:rFonts w:asciiTheme="minorHAnsi" w:eastAsiaTheme="minorEastAsia" w:hAnsiTheme="minorHAnsi" w:cstheme="minorBidi"/>
+          <w:color w:val="auto"/>
+          <w:sz w:val="22"/>
+          <w:szCs w:val="22"/>
+          <w:lang w:val="es-CO"/>
+        </w:rPr>
+        <w:t>Probing</w:t>
+      </w:r>
+      <w:proofErr w:type="spellEnd"/>
+      <w:r>
+        <w:rPr>
+          <w:rFonts w:asciiTheme="minorHAnsi" w:eastAsiaTheme="minorEastAsia" w:hAnsiTheme="minorHAnsi" w:cstheme="minorBidi"/>
+          <w:color w:val="auto"/>
+          <w:sz w:val="22"/>
+          <w:szCs w:val="22"/>
+          <w:lang w:val="es-CO"/>
+        </w:rPr>
+        <w:t xml:space="preserve"> porque solo hay 24 llaves (los meses de 2022 y 2023) sobre capacidad 211, con factor de carga real de 0.11 y colisiones casi nulas; </w:t>
+      </w:r>
+      <w:proofErr w:type="spellStart"/>
+      <w:r>
+        <w:rPr>
+          <w:rFonts w:asciiTheme="minorHAnsi" w:eastAsiaTheme="minorEastAsia" w:hAnsiTheme="minorHAnsi" w:cstheme="minorBidi"/>
+          <w:color w:val="auto"/>
+          <w:sz w:val="22"/>
+          <w:szCs w:val="22"/>
+          <w:lang w:val="es-CO"/>
+        </w:rPr>
+        <w:t>Separate</w:t>
+      </w:r>
+      <w:proofErr w:type="spellEnd"/>
+      <w:r>
+        <w:rPr>
+          <w:rFonts w:asciiTheme="minorHAnsi" w:eastAsiaTheme="minorEastAsia" w:hAnsiTheme="minorHAnsi" w:cstheme="minorBidi"/>
+          <w:color w:val="auto"/>
+          <w:sz w:val="22"/>
+          <w:szCs w:val="22"/>
+          <w:lang w:val="es-CO"/>
+        </w:rPr>
+        <w:t xml:space="preserve"> </w:t>
+      </w:r>
+      <w:proofErr w:type="spellStart"/>
+      <w:r>
+        <w:rPr>
+          <w:rFonts w:asciiTheme="minorHAnsi" w:eastAsiaTheme="minorEastAsia" w:hAnsiTheme="minorHAnsi" w:cstheme="minorBidi"/>
+          <w:color w:val="auto"/>
+          <w:sz w:val="22"/>
+          <w:szCs w:val="22"/>
+          <w:lang w:val="es-CO"/>
+        </w:rPr>
+        <w:t>Chaining</w:t>
+      </w:r>
+      <w:proofErr w:type="spellEnd"/>
+      <w:r>
+        <w:rPr>
+          <w:rFonts w:asciiTheme="minorHAnsi" w:eastAsiaTheme="minorEastAsia" w:hAnsiTheme="minorHAnsi" w:cstheme="minorBidi"/>
+          <w:color w:val="auto"/>
+          <w:sz w:val="22"/>
+          <w:szCs w:val="22"/>
+          <w:lang w:val="es-CO"/>
+        </w:rPr>
+        <w:t xml:space="preserve"> añadiría una lista encadenada por casilla sin necesidad. El ordenamiento es </w:t>
+      </w:r>
+      <w:proofErr w:type="spellStart"/>
+      <w:r>
+        <w:rPr>
+          <w:rFonts w:asciiTheme="minorHAnsi" w:eastAsiaTheme="minorEastAsia" w:hAnsiTheme="minorHAnsi" w:cstheme="minorBidi"/>
+          <w:color w:val="auto"/>
+          <w:sz w:val="22"/>
+          <w:szCs w:val="22"/>
+          <w:lang w:val="es-CO"/>
+        </w:rPr>
+        <w:t>Merge</w:t>
+      </w:r>
+      <w:proofErr w:type="spellEnd"/>
+      <w:r>
+        <w:rPr>
+          <w:rFonts w:asciiTheme="minorHAnsi" w:eastAsiaTheme="minorEastAsia" w:hAnsiTheme="minorHAnsi" w:cstheme="minorBidi"/>
+          <w:color w:val="auto"/>
+          <w:sz w:val="22"/>
+          <w:szCs w:val="22"/>
+          <w:lang w:val="es-CO"/>
+        </w:rPr>
+        <w:t xml:space="preserve"> </w:t>
+      </w:r>
+      <w:proofErr w:type="spellStart"/>
+      <w:r>
+        <w:rPr>
+          <w:rFonts w:asciiTheme="minorHAnsi" w:eastAsiaTheme="minorEastAsia" w:hAnsiTheme="minorHAnsi" w:cstheme="minorBidi"/>
+          <w:color w:val="auto"/>
+          <w:sz w:val="22"/>
+          <w:szCs w:val="22"/>
+          <w:lang w:val="es-CO"/>
+        </w:rPr>
+        <w:t>Sort</w:t>
+      </w:r>
+      <w:proofErr w:type="spellEnd"/>
+      <w:r>
+        <w:rPr>
+          <w:rFonts w:asciiTheme="minorHAnsi" w:eastAsiaTheme="minorEastAsia" w:hAnsiTheme="minorHAnsi" w:cstheme="minorBidi"/>
+          <w:color w:val="auto"/>
+          <w:sz w:val="22"/>
+          <w:szCs w:val="22"/>
+          <w:lang w:val="es-CO"/>
+        </w:rPr>
+        <w:t xml:space="preserve">, </w:t>
+      </w:r>
+      <w:proofErr w:type="gramStart"/>
+      <w:r>
+        <w:rPr>
+          <w:rFonts w:asciiTheme="minorHAnsi" w:eastAsiaTheme="minorEastAsia" w:hAnsiTheme="minorHAnsi" w:cstheme="minorBidi"/>
+          <w:color w:val="auto"/>
+          <w:sz w:val="22"/>
+          <w:szCs w:val="22"/>
+          <w:lang w:val="es-CO"/>
+        </w:rPr>
+        <w:t>O(</w:t>
+      </w:r>
+      <w:proofErr w:type="gramEnd"/>
+      <w:r>
+        <w:rPr>
+          <w:rFonts w:asciiTheme="minorHAnsi" w:eastAsiaTheme="minorEastAsia" w:hAnsiTheme="minorHAnsi" w:cstheme="minorBidi"/>
+          <w:color w:val="auto"/>
+          <w:sz w:val="22"/>
+          <w:szCs w:val="22"/>
+          <w:lang w:val="es-CO"/>
+        </w:rPr>
+        <w:t>k log k) garantizado y estable</w:t>
+      </w:r>
+      <w:r>
+        <w:rPr>
+          <w:rFonts w:asciiTheme="minorHAnsi" w:eastAsiaTheme="minorEastAsia" w:hAnsiTheme="minorHAnsi" w:cstheme="minorBidi"/>
+          <w:color w:val="auto"/>
+          <w:sz w:val="22"/>
+          <w:szCs w:val="22"/>
+          <w:lang w:val="es-CO"/>
+        </w:rPr>
+        <w:t>.</w:t>
+      </w:r>
+    </w:p>
+    <w:p>
+      <w:pPr>
         <w:jc w:val="both"/>
         <w:rPr>
           <w:lang w:val="es-419"/>
         </w:rPr>
       </w:pPr>
-      <w:r>
-        <w:rPr>
-          <w:lang w:val="es-419"/>
-        </w:rPr>
-        <w:t xml:space="preserve">A pesar </w:t>
-      </w:r>
-      <w:r>
-        <w:rPr>
-          <w:lang w:val="es-419"/>
-        </w:rPr>
-        <w:t>de que</w:t>
-      </w:r>
-      <w:r>
-        <w:rPr>
-          <w:lang w:val="es-419"/>
-        </w:rPr>
-        <w:t xml:space="preserve"> </w:t>
-      </w:r>
-      <w:r>
-        <w:rPr>
-          <w:lang w:val="es-419"/>
-        </w:rPr>
-        <w:t xml:space="preserve">obtener un elemento en </w:t>
-      </w:r>
-      <w:r>
-        <w:rPr>
-          <w:lang w:val="es-419"/>
-        </w:rPr>
-        <w:t xml:space="preserve">un </w:t>
-      </w:r>
-      <w:r>
-        <w:rPr>
-          <w:i/>
-          <w:iCs/>
-          <w:lang w:val="es-419"/>
-        </w:rPr>
-        <w:t>ArrayList</w:t>
-      </w:r>
-      <w:r>
-        <w:rPr>
-          <w:i/>
-          <w:iCs/>
-          <w:lang w:val="es-419"/>
-        </w:rPr>
-        <w:t>,</w:t>
-      </w:r>
-      <w:r>
-        <w:rPr>
-          <w:i/>
-          <w:iCs/>
-          <w:lang w:val="es-419"/>
-        </w:rPr>
-        <w:t xml:space="preserve"> </w:t>
-      </w:r>
-      <w:r>
-        <w:rPr>
-          <w:lang w:val="es-419"/>
-        </w:rPr>
-        <w:t>dada su posición</w:t>
-      </w:r>
-      <w:r>
-        <w:rPr>
-          <w:lang w:val="es-419"/>
-        </w:rPr>
-        <w:t>,</w:t>
-      </w:r>
-      <w:r>
-        <w:rPr>
-          <w:lang w:val="es-419"/>
-        </w:rPr>
-        <w:t xml:space="preserve"> tiene complejidad constante</w:t>
-      </w:r>
-      <w:r>
-        <w:rPr>
-          <w:lang w:val="es-419"/>
-        </w:rPr>
-        <w:t xml:space="preserve">, </w:t>
-      </w:r>
-      <w:r>
-        <w:rPr>
-          <w:lang w:val="es-419"/>
-        </w:rPr>
-        <w:t xml:space="preserve">la </w:t>
-      </w:r>
-      <w:r>
-        <w:rPr>
-          <w:lang w:val="es-419"/>
-        </w:rPr>
-        <w:t>implementación de este requerimiento tiene un orden lineal O(n).</w:t>
-      </w:r>
-      <w:r>
-        <w:rPr>
-          <w:lang w:val="es-419"/>
-        </w:rPr>
-        <w:t xml:space="preserve"> Esto debido a que</w:t>
-      </w:r>
-      <w:r>
-        <w:rPr>
-          <w:lang w:val="es-419"/>
-        </w:rPr>
-        <w:t>,</w:t>
-      </w:r>
-      <w:r>
-        <w:rPr>
-          <w:lang w:val="es-419"/>
-        </w:rPr>
-        <w:t xml:space="preserve"> </w:t>
-      </w:r>
-      <w:r>
-        <w:rPr>
-          <w:lang w:val="es-419"/>
-        </w:rPr>
-        <w:t xml:space="preserve">lo primero que se hace es verificar si el elemento hace parte de la lista. </w:t>
-      </w:r>
-      <w:r>
-        <w:rPr>
-          <w:lang w:val="es-419"/>
-        </w:rPr>
-        <w:t xml:space="preserve">Específicamente, </w:t>
-      </w:r>
-      <w:r>
-        <w:rPr>
-          <w:lang w:val="es-419"/>
-        </w:rPr>
-        <w:t xml:space="preserve">a la hora de buscar un elemento en una lista, en el peor de los casos </w:t>
-      </w:r>
-      <w:r>
-        <w:rPr>
-          <w:lang w:val="es-419"/>
-        </w:rPr>
-        <w:t>es necesario recorrer toda la lista</w:t>
-      </w:r>
-      <w:r>
-        <w:rPr>
-          <w:lang w:val="es-419"/>
-        </w:rPr>
-        <w:t>, es decir, complejidad lineal</w:t>
-      </w:r>
-      <w:r>
-        <w:rPr>
-          <w:lang w:val="es-419"/>
-        </w:rPr>
-        <w:t xml:space="preserve">. </w:t>
-      </w:r>
     </w:p>
     <w:sectPr>
-      <w:headerReference w:type="default" r:id="rId12"/>
-      <w:footerReference w:type="default" r:id="rId13"/>
-      <w:headerReference w:type="first" r:id="rId14"/>
-      <w:footerReference w:type="first" r:id="rId15"/>
+      <w:headerReference w:type="default" r:id="rId16"/>
+      <w:footerReference w:type="default" r:id="rId17"/>
+      <w:headerReference w:type="first" r:id="rId18"/>
+      <w:footerReference w:type="first" r:id="rId19"/>
       <w:pgSz w:w="12240" w:h="15840"/>
       <w:pgMar w:top="1440" w:right="1440" w:bottom="1440" w:left="1440" w:header="720" w:footer="720" w:gutter="0"/>
       <w:cols w:space="720"/>
@@ -1445,7 +1492,7 @@
 </file>
 
 <file path=word/endnotes.xml><?xml version="1.0" encoding="utf-8"?>
-<w:endnotes xmlns:wpc="http://schemas.microsoft.com/office/word/2010/wordprocessingCanvas" xmlns:cx="http://schemas.microsoft.com/office/drawing/2014/chartex" xmlns:cx1="http://schemas.microsoft.com/office/drawing/2015/9/8/chartex" xmlns:cx2="http://schemas.microsoft.com/office/drawing/2015/10/21/chartex" xmlns:cx3="http://schemas.microsoft.com/office/drawing/2016/5/9/chartex" xmlns:cx4="http://schemas.microsoft.com/office/drawing/2016/5/10/chartex" xmlns:cx5="http://schemas.microsoft.com/office/drawing/2016/5/11/chartex" xmlns:cx6="http://schemas.microsoft.com/office/drawing/2016/5/12/chartex" xmlns:cx7="http://schemas.microsoft.com/office/drawing/2016/5/13/chartex" xmlns:cx8="http://schemas.microsoft.com/office/drawing/2016/5/14/chartex" xmlns:mc="http://schemas.openxmlformats.org/markup-compatibility/2006" xmlns:aink="http://schemas.microsoft.com/office/drawing/2016/ink" xmlns:am3d="http://schemas.microsoft.com/office/drawing/2017/model3d" xmlns:o="urn:schemas-microsoft-com:office:office" xmlns:oel="http://schemas.microsoft.com/office/2019/extlst" xmlns:r="http://schemas.openxmlformats.org/officeDocument/2006/relationships" xmlns:m="http://schemas.openxmlformats.org/officeDocument/2006/math" xmlns:v="urn:schemas-microsoft-com:vml" xmlns:wp14="http://schemas.microsoft.com/office/word/2010/wordprocessingDrawing" xmlns:wp="http://schemas.openxmlformats.org/drawingml/2006/wordprocessingDrawing" xmlns:w10="urn:schemas-microsoft-com:office:word" xmlns:w="http://schemas.openxmlformats.org/wordprocessingml/2006/main" xmlns:w14="http://schemas.microsoft.com/office/word/2010/wordml" xmlns:w15="http://schemas.microsoft.com/office/word/2012/wordml" xmlns:w16cex="http://schemas.microsoft.com/office/word/2018/wordml/cex" xmlns:w16cid="http://schemas.microsoft.com/office/word/2016/wordml/cid" xmlns:w16="http://schemas.microsoft.com/office/word/2018/wordml" xmlns:w16du="http://schemas.microsoft.com/office/word/2023/wordml/word16du" xmlns:w16sdtdh="http://schemas.microsoft.com/office/word/2020/wordml/sdtdatahash" xmlns:w16sdtfl="http://schemas.microsoft.com/office/word/2024/wordml/sdtformatlock" xmlns:w16se="http://schemas.microsoft.com/office/word/2015/wordml/symex" xmlns:wpg="http://schemas.microsoft.com/office/word/2010/wordprocessingGroup" xmlns:wpi="http://schemas.microsoft.com/office/word/2010/wordprocessingInk" xmlns:wne="http://schemas.microsoft.com/office/word/2006/wordml" xmlns:wps="http://schemas.microsoft.com/office/word/2010/wordprocessingShape" mc:Ignorable="w14 w15 w16se w16cid w16 w16cex w16sdtdh w16sdtfl w16du wp14">
+<w:endnotes xmlns:wpc="http://schemas.microsoft.com/office/word/2010/wordprocessingCanvas" xmlns:cx="http://schemas.microsoft.com/office/drawing/2014/chartex" xmlns:cx1="http://schemas.microsoft.com/office/drawing/2015/9/8/chartex" xmlns:cx2="http://schemas.microsoft.com/office/drawing/2015/10/21/chartex" xmlns:cx3="http://schemas.microsoft.com/office/drawing/2016/5/9/chartex" xmlns:cx4="http://schemas.microsoft.com/office/drawing/2016/5/10/chartex" xmlns:cx5="http://schemas.microsoft.com/office/drawing/2016/5/11/chartex" xmlns:cx6="http://schemas.microsoft.com/office/drawing/2016/5/12/chartex" xmlns:cx7="http://schemas.microsoft.com/office/drawing/2016/5/13/chartex" xmlns:cx8="http://schemas.microsoft.com/office/drawing/2016/5/14/chartex" xmlns:mc="http://schemas.openxmlformats.org/markup-compatibility/2006" xmlns:aink="http://schemas.microsoft.com/office/drawing/2016/ink" xmlns:am3d="http://schemas.microsoft.com/office/drawing/2017/model3d" xmlns:o="urn:schemas-microsoft-com:office:office" xmlns:oel="http://schemas.microsoft.com/office/2019/extlst" xmlns:r="http://schemas.openxmlformats.org/officeDocument/2006/relationships" xmlns:m="http://schemas.openxmlformats.org/officeDocument/2006/math" xmlns:v="urn:schemas-microsoft-com:vml" xmlns:wp14="http://schemas.microsoft.com/office/word/2010/wordprocessingDrawing" xmlns:wp="http://schemas.openxmlformats.org/drawingml/2006/wordprocessingDrawing" xmlns:w10="urn:schemas-microsoft-com:office:word" xmlns:w="http://schemas.openxmlformats.org/wordprocessingml/2006/main" xmlns:w14="http://schemas.microsoft.com/office/word/2010/wordml" xmlns:w15="http://schemas.microsoft.com/office/word/2012/wordml" xmlns:w16cex="http://schemas.microsoft.com/office/word/2018/wordml/cex" xmlns:w16cid="http://schemas.microsoft.com/office/word/2016/wordml/cid" xmlns:w16="http://schemas.microsoft.com/office/word/2018/wordml" xmlns:w16du="http://schemas.microsoft.com/office/word/2023/wordml/word16du" xmlns:w16sdtdh="http://schemas.microsoft.com/office/word/2020/wordml/sdtdatahash" xmlns:w16se="http://schemas.microsoft.com/office/word/2015/wordml/symex" xmlns:wpg="http://schemas.microsoft.com/office/word/2010/wordprocessingGroup" xmlns:wpi="http://schemas.microsoft.com/office/word/2010/wordprocessingInk" xmlns:wne="http://schemas.microsoft.com/office/word/2006/wordml" xmlns:wps="http://schemas.microsoft.com/office/word/2010/wordprocessingShape" mc:Ignorable="w14 w15 w16se w16cid w16 w16cex w16sdtdh w16du wp14">
   <w:endnote w:type="separator" w:id="-1">
     <w:p>
       <w:pPr>
@@ -1477,7 +1524,7 @@
 </file>
 
 <file path=word/footer1.xml><?xml version="1.0" encoding="utf-8"?>
-<w:ftr xmlns:wpc="http://schemas.microsoft.com/office/word/2010/wordprocessingCanvas" xmlns:cx="http://schemas.microsoft.com/office/drawing/2014/chartex" xmlns:cx1="http://schemas.microsoft.com/office/drawing/2015/9/8/chartex" xmlns:cx2="http://schemas.microsoft.com/office/drawing/2015/10/21/chartex" xmlns:cx3="http://schemas.microsoft.com/office/drawing/2016/5/9/chartex" xmlns:cx4="http://schemas.microsoft.com/office/drawing/2016/5/10/chartex" xmlns:cx5="http://schemas.microsoft.com/office/drawing/2016/5/11/chartex" xmlns:cx6="http://schemas.microsoft.com/office/drawing/2016/5/12/chartex" xmlns:cx7="http://schemas.microsoft.com/office/drawing/2016/5/13/chartex" xmlns:cx8="http://schemas.microsoft.com/office/drawing/2016/5/14/chartex" xmlns:mc="http://schemas.openxmlformats.org/markup-compatibility/2006" xmlns:aink="http://schemas.microsoft.com/office/drawing/2016/ink" xmlns:am3d="http://schemas.microsoft.com/office/drawing/2017/model3d" xmlns:o="urn:schemas-microsoft-com:office:office" xmlns:oel="http://schemas.microsoft.com/office/2019/extlst" xmlns:r="http://schemas.openxmlformats.org/officeDocument/2006/relationships" xmlns:m="http://schemas.openxmlformats.org/officeDocument/2006/math" xmlns:v="urn:schemas-microsoft-com:vml" xmlns:wp14="http://schemas.microsoft.com/office/word/2010/wordprocessingDrawing" xmlns:wp="http://schemas.openxmlformats.org/drawingml/2006/wordprocessingDrawing" xmlns:w10="urn:schemas-microsoft-com:office:word" xmlns:w="http://schemas.openxmlformats.org/wordprocessingml/2006/main" xmlns:w14="http://schemas.microsoft.com/office/word/2010/wordml" xmlns:w15="http://schemas.microsoft.com/office/word/2012/wordml" xmlns:w16cex="http://schemas.microsoft.com/office/word/2018/wordml/cex" xmlns:w16cid="http://schemas.microsoft.com/office/word/2016/wordml/cid" xmlns:w16="http://schemas.microsoft.com/office/word/2018/wordml" xmlns:w16du="http://schemas.microsoft.com/office/word/2023/wordml/word16du" xmlns:w16sdtdh="http://schemas.microsoft.com/office/word/2020/wordml/sdtdatahash" xmlns:w16sdtfl="http://schemas.microsoft.com/office/word/2024/wordml/sdtformatlock" xmlns:w16se="http://schemas.microsoft.com/office/word/2015/wordml/symex" xmlns:wpg="http://schemas.microsoft.com/office/word/2010/wordprocessingGroup" xmlns:wpi="http://schemas.microsoft.com/office/word/2010/wordprocessingInk" xmlns:wne="http://schemas.microsoft.com/office/word/2006/wordml" xmlns:wps="http://schemas.microsoft.com/office/word/2010/wordprocessingShape" mc:Ignorable="w14 w15 w16se w16cid w16 w16cex w16sdtdh w16sdtfl w16du wp14">
+<w:ftr xmlns:wpc="http://schemas.microsoft.com/office/word/2010/wordprocessingCanvas" xmlns:cx="http://schemas.microsoft.com/office/drawing/2014/chartex" xmlns:cx1="http://schemas.microsoft.com/office/drawing/2015/9/8/chartex" xmlns:cx2="http://schemas.microsoft.com/office/drawing/2015/10/21/chartex" xmlns:cx3="http://schemas.microsoft.com/office/drawing/2016/5/9/chartex" xmlns:cx4="http://schemas.microsoft.com/office/drawing/2016/5/10/chartex" xmlns:cx5="http://schemas.microsoft.com/office/drawing/2016/5/11/chartex" xmlns:cx6="http://schemas.microsoft.com/office/drawing/2016/5/12/chartex" xmlns:cx7="http://schemas.microsoft.com/office/drawing/2016/5/13/chartex" xmlns:cx8="http://schemas.microsoft.com/office/drawing/2016/5/14/chartex" xmlns:mc="http://schemas.openxmlformats.org/markup-compatibility/2006" xmlns:aink="http://schemas.microsoft.com/office/drawing/2016/ink" xmlns:am3d="http://schemas.microsoft.com/office/drawing/2017/model3d" xmlns:o="urn:schemas-microsoft-com:office:office" xmlns:oel="http://schemas.microsoft.com/office/2019/extlst" xmlns:r="http://schemas.openxmlformats.org/officeDocument/2006/relationships" xmlns:m="http://schemas.openxmlformats.org/officeDocument/2006/math" xmlns:v="urn:schemas-microsoft-com:vml" xmlns:wp14="http://schemas.microsoft.com/office/word/2010/wordprocessingDrawing" xmlns:wp="http://schemas.openxmlformats.org/drawingml/2006/wordprocessingDrawing" xmlns:w10="urn:schemas-microsoft-com:office:word" xmlns:w="http://schemas.openxmlformats.org/wordprocessingml/2006/main" xmlns:w14="http://schemas.microsoft.com/office/word/2010/wordml" xmlns:w15="http://schemas.microsoft.com/office/word/2012/wordml" xmlns:w16cex="http://schemas.microsoft.com/office/word/2018/wordml/cex" xmlns:w16cid="http://schemas.microsoft.com/office/word/2016/wordml/cid" xmlns:w16="http://schemas.microsoft.com/office/word/2018/wordml" xmlns:w16du="http://schemas.microsoft.com/office/word/2023/wordml/word16du" xmlns:w16sdtdh="http://schemas.microsoft.com/office/word/2020/wordml/sdtdatahash" xmlns:w16se="http://schemas.microsoft.com/office/word/2015/wordml/symex" xmlns:wpg="http://schemas.microsoft.com/office/word/2010/wordprocessingGroup" xmlns:wpi="http://schemas.microsoft.com/office/word/2010/wordprocessingInk" xmlns:wne="http://schemas.microsoft.com/office/word/2006/wordml" xmlns:wps="http://schemas.microsoft.com/office/word/2010/wordprocessingShape" mc:Ignorable="w14 w15 w16se w16cid w16 w16cex w16sdtdh w16du wp14">
   <w:tbl>
     <w:tblPr>
       <w:tblW w:w="0" w:type="auto"/>
@@ -1535,7 +1582,7 @@
 </file>
 
 <file path=word/footer2.xml><?xml version="1.0" encoding="utf-8"?>
-<w:ftr xmlns:wpc="http://schemas.microsoft.com/office/word/2010/wordprocessingCanvas" xmlns:cx="http://schemas.microsoft.com/office/drawing/2014/chartex" xmlns:cx1="http://schemas.microsoft.com/office/drawing/2015/9/8/chartex" xmlns:cx2="http://schemas.microsoft.com/office/drawing/2015/10/21/chartex" xmlns:cx3="http://schemas.microsoft.com/office/drawing/2016/5/9/chartex" xmlns:cx4="http://schemas.microsoft.com/office/drawing/2016/5/10/chartex" xmlns:cx5="http://schemas.microsoft.com/office/drawing/2016/5/11/chartex" xmlns:cx6="http://schemas.microsoft.com/office/drawing/2016/5/12/chartex" xmlns:cx7="http://schemas.microsoft.com/office/drawing/2016/5/13/chartex" xmlns:cx8="http://schemas.microsoft.com/office/drawing/2016/5/14/chartex" xmlns:mc="http://schemas.openxmlformats.org/markup-compatibility/2006" xmlns:aink="http://schemas.microsoft.com/office/drawing/2016/ink" xmlns:am3d="http://schemas.microsoft.com/office/drawing/2017/model3d" xmlns:o="urn:schemas-microsoft-com:office:office" xmlns:oel="http://schemas.microsoft.com/office/2019/extlst" xmlns:r="http://schemas.openxmlformats.org/officeDocument/2006/relationships" xmlns:m="http://schemas.openxmlformats.org/officeDocument/2006/math" xmlns:v="urn:schemas-microsoft-com:vml" xmlns:wp14="http://schemas.microsoft.com/office/word/2010/wordprocessingDrawing" xmlns:wp="http://schemas.openxmlformats.org/drawingml/2006/wordprocessingDrawing" xmlns:w10="urn:schemas-microsoft-com:office:word" xmlns:w="http://schemas.openxmlformats.org/wordprocessingml/2006/main" xmlns:w14="http://schemas.microsoft.com/office/word/2010/wordml" xmlns:w15="http://schemas.microsoft.com/office/word/2012/wordml" xmlns:w16cex="http://schemas.microsoft.com/office/word/2018/wordml/cex" xmlns:w16cid="http://schemas.microsoft.com/office/word/2016/wordml/cid" xmlns:w16="http://schemas.microsoft.com/office/word/2018/wordml" xmlns:w16du="http://schemas.microsoft.com/office/word/2023/wordml/word16du" xmlns:w16sdtdh="http://schemas.microsoft.com/office/word/2020/wordml/sdtdatahash" xmlns:w16sdtfl="http://schemas.microsoft.com/office/word/2024/wordml/sdtformatlock" xmlns:w16se="http://schemas.microsoft.com/office/word/2015/wordml/symex" xmlns:wpg="http://schemas.microsoft.com/office/word/2010/wordprocessingGroup" xmlns:wpi="http://schemas.microsoft.com/office/word/2010/wordprocessingInk" xmlns:wne="http://schemas.microsoft.com/office/word/2006/wordml" xmlns:wps="http://schemas.microsoft.com/office/word/2010/wordprocessingShape" mc:Ignorable="w14 w15 w16se w16cid w16 w16cex w16sdtdh w16sdtfl w16du wp14">
+<w:ftr xmlns:wpc="http://schemas.microsoft.com/office/word/2010/wordprocessingCanvas" xmlns:cx="http://schemas.microsoft.com/office/drawing/2014/chartex" xmlns:cx1="http://schemas.microsoft.com/office/drawing/2015/9/8/chartex" xmlns:cx2="http://schemas.microsoft.com/office/drawing/2015/10/21/chartex" xmlns:cx3="http://schemas.microsoft.com/office/drawing/2016/5/9/chartex" xmlns:cx4="http://schemas.microsoft.com/office/drawing/2016/5/10/chartex" xmlns:cx5="http://schemas.microsoft.com/office/drawing/2016/5/11/chartex" xmlns:cx6="http://schemas.microsoft.com/office/drawing/2016/5/12/chartex" xmlns:cx7="http://schemas.microsoft.com/office/drawing/2016/5/13/chartex" xmlns:cx8="http://schemas.microsoft.com/office/drawing/2016/5/14/chartex" xmlns:mc="http://schemas.openxmlformats.org/markup-compatibility/2006" xmlns:aink="http://schemas.microsoft.com/office/drawing/2016/ink" xmlns:am3d="http://schemas.microsoft.com/office/drawing/2017/model3d" xmlns:o="urn:schemas-microsoft-com:office:office" xmlns:oel="http://schemas.microsoft.com/office/2019/extlst" xmlns:r="http://schemas.openxmlformats.org/officeDocument/2006/relationships" xmlns:m="http://schemas.openxmlformats.org/officeDocument/2006/math" xmlns:v="urn:schemas-microsoft-com:vml" xmlns:wp14="http://schemas.microsoft.com/office/word/2010/wordprocessingDrawing" xmlns:wp="http://schemas.openxmlformats.org/drawingml/2006/wordprocessingDrawing" xmlns:w10="urn:schemas-microsoft-com:office:word" xmlns:w="http://schemas.openxmlformats.org/wordprocessingml/2006/main" xmlns:w14="http://schemas.microsoft.com/office/word/2010/wordml" xmlns:w15="http://schemas.microsoft.com/office/word/2012/wordml" xmlns:w16cex="http://schemas.microsoft.com/office/word/2018/wordml/cex" xmlns:w16cid="http://schemas.microsoft.com/office/word/2016/wordml/cid" xmlns:w16="http://schemas.microsoft.com/office/word/2018/wordml" xmlns:w16du="http://schemas.microsoft.com/office/word/2023/wordml/word16du" xmlns:w16sdtdh="http://schemas.microsoft.com/office/word/2020/wordml/sdtdatahash" xmlns:w16se="http://schemas.microsoft.com/office/word/2015/wordml/symex" xmlns:wpg="http://schemas.microsoft.com/office/word/2010/wordprocessingGroup" xmlns:wpi="http://schemas.microsoft.com/office/word/2010/wordprocessingInk" xmlns:wne="http://schemas.microsoft.com/office/word/2006/wordml" xmlns:wps="http://schemas.microsoft.com/office/word/2010/wordprocessingShape" mc:Ignorable="w14 w15 w16se w16cid w16 w16cex w16sdtdh w16du wp14">
   <w:tbl>
     <w:tblPr>
       <w:tblW w:w="0" w:type="auto"/>
@@ -1593,7 +1640,7 @@
 </file>
 
 <file path=word/footnotes.xml><?xml version="1.0" encoding="utf-8"?>
-<w:footnotes xmlns:wpc="http://schemas.microsoft.com/office/word/2010/wordprocessingCanvas" xmlns:cx="http://schemas.microsoft.com/office/drawing/2014/chartex" xmlns:cx1="http://schemas.microsoft.com/office/drawing/2015/9/8/chartex" xmlns:cx2="http://schemas.microsoft.com/office/drawing/2015/10/21/chartex" xmlns:cx3="http://schemas.microsoft.com/office/drawing/2016/5/9/chartex" xmlns:cx4="http://schemas.microsoft.com/office/drawing/2016/5/10/chartex" xmlns:cx5="http://schemas.microsoft.com/office/drawing/2016/5/11/chartex" xmlns:cx6="http://schemas.microsoft.com/office/drawing/2016/5/12/chartex" xmlns:cx7="http://schemas.microsoft.com/office/drawing/2016/5/13/chartex" xmlns:cx8="http://schemas.microsoft.com/office/drawing/2016/5/14/chartex" xmlns:mc="http://schemas.openxmlformats.org/markup-compatibility/2006" xmlns:aink="http://schemas.microsoft.com/office/drawing/2016/ink" xmlns:am3d="http://schemas.microsoft.com/office/drawing/2017/model3d" xmlns:o="urn:schemas-microsoft-com:office:office" xmlns:oel="http://schemas.microsoft.com/office/2019/extlst" xmlns:r="http://schemas.openxmlformats.org/officeDocument/2006/relationships" xmlns:m="http://schemas.openxmlformats.org/officeDocument/2006/math" xmlns:v="urn:schemas-microsoft-com:vml" xmlns:wp14="http://schemas.microsoft.com/office/word/2010/wordprocessingDrawing" xmlns:wp="http://schemas.openxmlformats.org/drawingml/2006/wordprocessingDrawing" xmlns:w10="urn:schemas-microsoft-com:office:word" xmlns:w="http://schemas.openxmlformats.org/wordprocessingml/2006/main" xmlns:w14="http://schemas.microsoft.com/office/word/2010/wordml" xmlns:w15="http://schemas.microsoft.com/office/word/2012/wordml" xmlns:w16cex="http://schemas.microsoft.com/office/word/2018/wordml/cex" xmlns:w16cid="http://schemas.microsoft.com/office/word/2016/wordml/cid" xmlns:w16="http://schemas.microsoft.com/office/word/2018/wordml" xmlns:w16du="http://schemas.microsoft.com/office/word/2023/wordml/word16du" xmlns:w16sdtdh="http://schemas.microsoft.com/office/word/2020/wordml/sdtdatahash" xmlns:w16sdtfl="http://schemas.microsoft.com/office/word/2024/wordml/sdtformatlock" xmlns:w16se="http://schemas.microsoft.com/office/word/2015/wordml/symex" xmlns:wpg="http://schemas.microsoft.com/office/word/2010/wordprocessingGroup" xmlns:wpi="http://schemas.microsoft.com/office/word/2010/wordprocessingInk" xmlns:wne="http://schemas.microsoft.com/office/word/2006/wordml" xmlns:wps="http://schemas.microsoft.com/office/word/2010/wordprocessingShape" mc:Ignorable="w14 w15 w16se w16cid w16 w16cex w16sdtdh w16sdtfl w16du wp14">
+<w:footnotes xmlns:wpc="http://schemas.microsoft.com/office/word/2010/wordprocessingCanvas" xmlns:cx="http://schemas.microsoft.com/office/drawing/2014/chartex" xmlns:cx1="http://schemas.microsoft.com/office/drawing/2015/9/8/chartex" xmlns:cx2="http://schemas.microsoft.com/office/drawing/2015/10/21/chartex" xmlns:cx3="http://schemas.microsoft.com/office/drawing/2016/5/9/chartex" xmlns:cx4="http://schemas.microsoft.com/office/drawing/2016/5/10/chartex" xmlns:cx5="http://schemas.microsoft.com/office/drawing/2016/5/11/chartex" xmlns:cx6="http://schemas.microsoft.com/office/drawing/2016/5/12/chartex" xmlns:cx7="http://schemas.microsoft.com/office/drawing/2016/5/13/chartex" xmlns:cx8="http://schemas.microsoft.com/office/drawing/2016/5/14/chartex" xmlns:mc="http://schemas.openxmlformats.org/markup-compatibility/2006" xmlns:aink="http://schemas.microsoft.com/office/drawing/2016/ink" xmlns:am3d="http://schemas.microsoft.com/office/drawing/2017/model3d" xmlns:o="urn:schemas-microsoft-com:office:office" xmlns:oel="http://schemas.microsoft.com/office/2019/extlst" xmlns:r="http://schemas.openxmlformats.org/officeDocument/2006/relationships" xmlns:m="http://schemas.openxmlformats.org/officeDocument/2006/math" xmlns:v="urn:schemas-microsoft-com:vml" xmlns:wp14="http://schemas.microsoft.com/office/word/2010/wordprocessingDrawing" xmlns:wp="http://schemas.openxmlformats.org/drawingml/2006/wordprocessingDrawing" xmlns:w10="urn:schemas-microsoft-com:office:word" xmlns:w="http://schemas.openxmlformats.org/wordprocessingml/2006/main" xmlns:w14="http://schemas.microsoft.com/office/word/2010/wordml" xmlns:w15="http://schemas.microsoft.com/office/word/2012/wordml" xmlns:w16cex="http://schemas.microsoft.com/office/word/2018/wordml/cex" xmlns:w16cid="http://schemas.microsoft.com/office/word/2016/wordml/cid" xmlns:w16="http://schemas.microsoft.com/office/word/2018/wordml" xmlns:w16du="http://schemas.microsoft.com/office/word/2023/wordml/word16du" xmlns:w16sdtdh="http://schemas.microsoft.com/office/word/2020/wordml/sdtdatahash" xmlns:w16se="http://schemas.microsoft.com/office/word/2015/wordml/symex" xmlns:wpg="http://schemas.microsoft.com/office/word/2010/wordprocessingGroup" xmlns:wpi="http://schemas.microsoft.com/office/word/2010/wordprocessingInk" xmlns:wne="http://schemas.microsoft.com/office/word/2006/wordml" xmlns:wps="http://schemas.microsoft.com/office/word/2010/wordprocessingShape" mc:Ignorable="w14 w15 w16se w16cid w16 w16cex w16sdtdh w16du wp14">
   <w:footnote w:type="separator" w:id="-1">
     <w:p>
       <w:pPr>
@@ -1625,7 +1672,7 @@
 </file>
 
 <file path=word/header1.xml><?xml version="1.0" encoding="utf-8"?>
-<w:hdr xmlns:wpc="http://schemas.microsoft.com/office/word/2010/wordprocessingCanvas" xmlns:cx="http://schemas.microsoft.com/office/drawing/2014/chartex" xmlns:cx1="http://schemas.microsoft.com/office/drawing/2015/9/8/chartex" xmlns:cx2="http://schemas.microsoft.com/office/drawing/2015/10/21/chartex" xmlns:cx3="http://schemas.microsoft.com/office/drawing/2016/5/9/chartex" xmlns:cx4="http://schemas.microsoft.com/office/drawing/2016/5/10/chartex" xmlns:cx5="http://schemas.microsoft.com/office/drawing/2016/5/11/chartex" xmlns:cx6="http://schemas.microsoft.com/office/drawing/2016/5/12/chartex" xmlns:cx7="http://schemas.microsoft.com/office/drawing/2016/5/13/chartex" xmlns:cx8="http://schemas.microsoft.com/office/drawing/2016/5/14/chartex" xmlns:mc="http://schemas.openxmlformats.org/markup-compatibility/2006" xmlns:aink="http://schemas.microsoft.com/office/drawing/2016/ink" xmlns:am3d="http://schemas.microsoft.com/office/drawing/2017/model3d" xmlns:o="urn:schemas-microsoft-com:office:office" xmlns:oel="http://schemas.microsoft.com/office/2019/extlst" xmlns:r="http://schemas.openxmlformats.org/officeDocument/2006/relationships" xmlns:m="http://schemas.openxmlformats.org/officeDocument/2006/math" xmlns:v="urn:schemas-microsoft-com:vml" xmlns:wp14="http://schemas.microsoft.com/office/word/2010/wordprocessingDrawing" xmlns:wp="http://schemas.openxmlformats.org/drawingml/2006/wordprocessingDrawing" xmlns:w10="urn:schemas-microsoft-com:office:word" xmlns:w="http://schemas.openxmlformats.org/wordprocessingml/2006/main" xmlns:w14="http://schemas.microsoft.com/office/word/2010/wordml" xmlns:w15="http://schemas.microsoft.com/office/word/2012/wordml" xmlns:w16cex="http://schemas.microsoft.com/office/word/2018/wordml/cex" xmlns:w16cid="http://schemas.microsoft.com/office/word/2016/wordml/cid" xmlns:w16="http://schemas.microsoft.com/office/word/2018/wordml" xmlns:w16du="http://schemas.microsoft.com/office/word/2023/wordml/word16du" xmlns:w16sdtdh="http://schemas.microsoft.com/office/word/2020/wordml/sdtdatahash" xmlns:w16sdtfl="http://schemas.microsoft.com/office/word/2024/wordml/sdtformatlock" xmlns:w16se="http://schemas.microsoft.com/office/word/2015/wordml/symex" xmlns:wpg="http://schemas.microsoft.com/office/word/2010/wordprocessingGroup" xmlns:wpi="http://schemas.microsoft.com/office/word/2010/wordprocessingInk" xmlns:wne="http://schemas.microsoft.com/office/word/2006/wordml" xmlns:wps="http://schemas.microsoft.com/office/word/2010/wordprocessingShape" mc:Ignorable="w14 w15 w16se w16cid w16 w16cex w16sdtdh w16sdtfl w16du wp14">
+<w:hdr xmlns:wpc="http://schemas.microsoft.com/office/word/2010/wordprocessingCanvas" xmlns:cx="http://schemas.microsoft.com/office/drawing/2014/chartex" xmlns:cx1="http://schemas.microsoft.com/office/drawing/2015/9/8/chartex" xmlns:cx2="http://schemas.microsoft.com/office/drawing/2015/10/21/chartex" xmlns:cx3="http://schemas.microsoft.com/office/drawing/2016/5/9/chartex" xmlns:cx4="http://schemas.microsoft.com/office/drawing/2016/5/10/chartex" xmlns:cx5="http://schemas.microsoft.com/office/drawing/2016/5/11/chartex" xmlns:cx6="http://schemas.microsoft.com/office/drawing/2016/5/12/chartex" xmlns:cx7="http://schemas.microsoft.com/office/drawing/2016/5/13/chartex" xmlns:cx8="http://schemas.microsoft.com/office/drawing/2016/5/14/chartex" xmlns:mc="http://schemas.openxmlformats.org/markup-compatibility/2006" xmlns:aink="http://schemas.microsoft.com/office/drawing/2016/ink" xmlns:am3d="http://schemas.microsoft.com/office/drawing/2017/model3d" xmlns:o="urn:schemas-microsoft-com:office:office" xmlns:oel="http://schemas.microsoft.com/office/2019/extlst" xmlns:r="http://schemas.openxmlformats.org/officeDocument/2006/relationships" xmlns:m="http://schemas.openxmlformats.org/officeDocument/2006/math" xmlns:v="urn:schemas-microsoft-com:vml" xmlns:wp14="http://schemas.microsoft.com/office/word/2010/wordprocessingDrawing" xmlns:wp="http://schemas.openxmlformats.org/drawingml/2006/wordprocessingDrawing" xmlns:w10="urn:schemas-microsoft-com:office:word" xmlns:w="http://schemas.openxmlformats.org/wordprocessingml/2006/main" xmlns:w14="http://schemas.microsoft.com/office/word/2010/wordml" xmlns:w15="http://schemas.microsoft.com/office/word/2012/wordml" xmlns:w16cex="http://schemas.microsoft.com/office/word/2018/wordml/cex" xmlns:w16cid="http://schemas.microsoft.com/office/word/2016/wordml/cid" xmlns:w16="http://schemas.microsoft.com/office/word/2018/wordml" xmlns:w16du="http://schemas.microsoft.com/office/word/2023/wordml/word16du" xmlns:w16sdtdh="http://schemas.microsoft.com/office/word/2020/wordml/sdtdatahash" xmlns:w16se="http://schemas.microsoft.com/office/word/2015/wordml/symex" xmlns:wpg="http://schemas.microsoft.com/office/word/2010/wordprocessingGroup" xmlns:wpi="http://schemas.microsoft.com/office/word/2010/wordprocessingInk" xmlns:wne="http://schemas.microsoft.com/office/word/2006/wordml" xmlns:wps="http://schemas.microsoft.com/office/word/2010/wordprocessingShape" mc:Ignorable="w14 w15 w16se w16cid w16 w16cex w16sdtdh w16du wp14">
   <w:tbl>
     <w:tblPr>
       <w:tblW w:w="0" w:type="auto"/>
@@ -1683,7 +1730,7 @@
 </file>
 
 <file path=word/header2.xml><?xml version="1.0" encoding="utf-8"?>
-<w:hdr xmlns:wpc="http://schemas.microsoft.com/office/word/2010/wordprocessingCanvas" xmlns:cx="http://schemas.microsoft.com/office/drawing/2014/chartex" xmlns:cx1="http://schemas.microsoft.com/office/drawing/2015/9/8/chartex" xmlns:cx2="http://schemas.microsoft.com/office/drawing/2015/10/21/chartex" xmlns:cx3="http://schemas.microsoft.com/office/drawing/2016/5/9/chartex" xmlns:cx4="http://schemas.microsoft.com/office/drawing/2016/5/10/chartex" xmlns:cx5="http://schemas.microsoft.com/office/drawing/2016/5/11/chartex" xmlns:cx6="http://schemas.microsoft.com/office/drawing/2016/5/12/chartex" xmlns:cx7="http://schemas.microsoft.com/office/drawing/2016/5/13/chartex" xmlns:cx8="http://schemas.microsoft.com/office/drawing/2016/5/14/chartex" xmlns:mc="http://schemas.openxmlformats.org/markup-compatibility/2006" xmlns:aink="http://schemas.microsoft.com/office/drawing/2016/ink" xmlns:am3d="http://schemas.microsoft.com/office/drawing/2017/model3d" xmlns:o="urn:schemas-microsoft-com:office:office" xmlns:oel="http://schemas.microsoft.com/office/2019/extlst" xmlns:r="http://schemas.openxmlformats.org/officeDocument/2006/relationships" xmlns:m="http://schemas.openxmlformats.org/officeDocument/2006/math" xmlns:v="urn:schemas-microsoft-com:vml" xmlns:wp14="http://schemas.microsoft.com/office/word/2010/wordprocessingDrawing" xmlns:wp="http://schemas.openxmlformats.org/drawingml/2006/wordprocessingDrawing" xmlns:w10="urn:schemas-microsoft-com:office:word" xmlns:w="http://schemas.openxmlformats.org/wordprocessingml/2006/main" xmlns:w14="http://schemas.microsoft.com/office/word/2010/wordml" xmlns:w15="http://schemas.microsoft.com/office/word/2012/wordml" xmlns:w16cex="http://schemas.microsoft.com/office/word/2018/wordml/cex" xmlns:w16cid="http://schemas.microsoft.com/office/word/2016/wordml/cid" xmlns:w16="http://schemas.microsoft.com/office/word/2018/wordml" xmlns:w16du="http://schemas.microsoft.com/office/word/2023/wordml/word16du" xmlns:w16sdtdh="http://schemas.microsoft.com/office/word/2020/wordml/sdtdatahash" xmlns:w16sdtfl="http://schemas.microsoft.com/office/word/2024/wordml/sdtformatlock" xmlns:w16se="http://schemas.microsoft.com/office/word/2015/wordml/symex" xmlns:wpg="http://schemas.microsoft.com/office/word/2010/wordprocessingGroup" xmlns:wpi="http://schemas.microsoft.com/office/word/2010/wordprocessingInk" xmlns:wne="http://schemas.microsoft.com/office/word/2006/wordml" xmlns:wps="http://schemas.microsoft.com/office/word/2010/wordprocessingShape" mc:Ignorable="w14 w15 w16se w16cid w16 w16cex w16sdtdh w16sdtfl w16du wp14">
+<w:hdr xmlns:wpc="http://schemas.microsoft.com/office/word/2010/wordprocessingCanvas" xmlns:cx="http://schemas.microsoft.com/office/drawing/2014/chartex" xmlns:cx1="http://schemas.microsoft.com/office/drawing/2015/9/8/chartex" xmlns:cx2="http://schemas.microsoft.com/office/drawing/2015/10/21/chartex" xmlns:cx3="http://schemas.microsoft.com/office/drawing/2016/5/9/chartex" xmlns:cx4="http://schemas.microsoft.com/office/drawing/2016/5/10/chartex" xmlns:cx5="http://schemas.microsoft.com/office/drawing/2016/5/11/chartex" xmlns:cx6="http://schemas.microsoft.com/office/drawing/2016/5/12/chartex" xmlns:cx7="http://schemas.microsoft.com/office/drawing/2016/5/13/chartex" xmlns:cx8="http://schemas.microsoft.com/office/drawing/2016/5/14/chartex" xmlns:mc="http://schemas.openxmlformats.org/markup-compatibility/2006" xmlns:aink="http://schemas.microsoft.com/office/drawing/2016/ink" xmlns:am3d="http://schemas.microsoft.com/office/drawing/2017/model3d" xmlns:o="urn:schemas-microsoft-com:office:office" xmlns:oel="http://schemas.microsoft.com/office/2019/extlst" xmlns:r="http://schemas.openxmlformats.org/officeDocument/2006/relationships" xmlns:m="http://schemas.openxmlformats.org/officeDocument/2006/math" xmlns:v="urn:schemas-microsoft-com:vml" xmlns:wp14="http://schemas.microsoft.com/office/word/2010/wordprocessingDrawing" xmlns:wp="http://schemas.openxmlformats.org/drawingml/2006/wordprocessingDrawing" xmlns:w10="urn:schemas-microsoft-com:office:word" xmlns:w="http://schemas.openxmlformats.org/wordprocessingml/2006/main" xmlns:w14="http://schemas.microsoft.com/office/word/2010/wordml" xmlns:w15="http://schemas.microsoft.com/office/word/2012/wordml" xmlns:w16cex="http://schemas.microsoft.com/office/word/2018/wordml/cex" xmlns:w16cid="http://schemas.microsoft.com/office/word/2016/wordml/cid" xmlns:w16="http://schemas.microsoft.com/office/word/2018/wordml" xmlns:w16du="http://schemas.microsoft.com/office/word/2023/wordml/word16du" xmlns:w16sdtdh="http://schemas.microsoft.com/office/word/2020/wordml/sdtdatahash" xmlns:w16se="http://schemas.microsoft.com/office/word/2015/wordml/symex" xmlns:wpg="http://schemas.microsoft.com/office/word/2010/wordprocessingGroup" xmlns:wpi="http://schemas.microsoft.com/office/word/2010/wordprocessingInk" xmlns:wne="http://schemas.microsoft.com/office/word/2006/wordml" xmlns:wps="http://schemas.microsoft.com/office/word/2010/wordprocessingShape" mc:Ignorable="w14 w15 w16se w16cid w16 w16cex w16sdtdh w16du wp14">
   <w:tbl>
     <w:tblPr>
       <w:tblStyle w:val="Tablaconcuadrcula"/>
@@ -1937,7 +1984,7 @@
 </file>
 
 <file path=word/numbering.xml><?xml version="1.0" encoding="utf-8"?>
-<w:numbering xmlns:wpc="http://schemas.microsoft.com/office/word/2010/wordprocessingCanvas" xmlns:cx="http://schemas.microsoft.com/office/drawing/2014/chartex" xmlns:cx1="http://schemas.microsoft.com/office/drawing/2015/9/8/chartex" xmlns:cx2="http://schemas.microsoft.com/office/drawing/2015/10/21/chartex" xmlns:cx3="http://schemas.microsoft.com/office/drawing/2016/5/9/chartex" xmlns:cx4="http://schemas.microsoft.com/office/drawing/2016/5/10/chartex" xmlns:cx5="http://schemas.microsoft.com/office/drawing/2016/5/11/chartex" xmlns:cx6="http://schemas.microsoft.com/office/drawing/2016/5/12/chartex" xmlns:cx7="http://schemas.microsoft.com/office/drawing/2016/5/13/chartex" xmlns:cx8="http://schemas.microsoft.com/office/drawing/2016/5/14/chartex" xmlns:mc="http://schemas.openxmlformats.org/markup-compatibility/2006" xmlns:aink="http://schemas.microsoft.com/office/drawing/2016/ink" xmlns:am3d="http://schemas.microsoft.com/office/drawing/2017/model3d" xmlns:o="urn:schemas-microsoft-com:office:office" xmlns:oel="http://schemas.microsoft.com/office/2019/extlst" xmlns:r="http://schemas.openxmlformats.org/officeDocument/2006/relationships" xmlns:m="http://schemas.openxmlformats.org/officeDocument/2006/math" xmlns:v="urn:schemas-microsoft-com:vml" xmlns:wp14="http://schemas.microsoft.com/office/word/2010/wordprocessingDrawing" xmlns:wp="http://schemas.openxmlformats.org/drawingml/2006/wordprocessingDrawing" xmlns:w10="urn:schemas-microsoft-com:office:word" xmlns:w="http://schemas.openxmlformats.org/wordprocessingml/2006/main" xmlns:w14="http://schemas.microsoft.com/office/word/2010/wordml" xmlns:w15="http://schemas.microsoft.com/office/word/2012/wordml" xmlns:w16cex="http://schemas.microsoft.com/office/word/2018/wordml/cex" xmlns:w16cid="http://schemas.microsoft.com/office/word/2016/wordml/cid" xmlns:w16="http://schemas.microsoft.com/office/word/2018/wordml" xmlns:w16du="http://schemas.microsoft.com/office/word/2023/wordml/word16du" xmlns:w16sdtdh="http://schemas.microsoft.com/office/word/2020/wordml/sdtdatahash" xmlns:w16sdtfl="http://schemas.microsoft.com/office/word/2024/wordml/sdtformatlock" xmlns:w16se="http://schemas.microsoft.com/office/word/2015/wordml/symex" xmlns:wpg="http://schemas.microsoft.com/office/word/2010/wordprocessingGroup" xmlns:wpi="http://schemas.microsoft.com/office/word/2010/wordprocessingInk" xmlns:wne="http://schemas.microsoft.com/office/word/2006/wordml" xmlns:wps="http://schemas.microsoft.com/office/word/2010/wordprocessingShape" mc:Ignorable="w14 w15 w16se w16cid w16 w16cex w16sdtdh w16sdtfl w16du wp14">
+<w:numbering xmlns:wpc="http://schemas.microsoft.com/office/word/2010/wordprocessingCanvas" xmlns:cx="http://schemas.microsoft.com/office/drawing/2014/chartex" xmlns:cx1="http://schemas.microsoft.com/office/drawing/2015/9/8/chartex" xmlns:cx2="http://schemas.microsoft.com/office/drawing/2015/10/21/chartex" xmlns:cx3="http://schemas.microsoft.com/office/drawing/2016/5/9/chartex" xmlns:cx4="http://schemas.microsoft.com/office/drawing/2016/5/10/chartex" xmlns:cx5="http://schemas.microsoft.com/office/drawing/2016/5/11/chartex" xmlns:cx6="http://schemas.microsoft.com/office/drawing/2016/5/12/chartex" xmlns:cx7="http://schemas.microsoft.com/office/drawing/2016/5/13/chartex" xmlns:cx8="http://schemas.microsoft.com/office/drawing/2016/5/14/chartex" xmlns:mc="http://schemas.openxmlformats.org/markup-compatibility/2006" xmlns:aink="http://schemas.microsoft.com/office/drawing/2016/ink" xmlns:am3d="http://schemas.microsoft.com/office/drawing/2017/model3d" xmlns:o="urn:schemas-microsoft-com:office:office" xmlns:oel="http://schemas.microsoft.com/office/2019/extlst" xmlns:r="http://schemas.openxmlformats.org/officeDocument/2006/relationships" xmlns:m="http://schemas.openxmlformats.org/officeDocument/2006/math" xmlns:v="urn:schemas-microsoft-com:vml" xmlns:wp14="http://schemas.microsoft.com/office/word/2010/wordprocessingDrawing" xmlns:wp="http://schemas.openxmlformats.org/drawingml/2006/wordprocessingDrawing" xmlns:w10="urn:schemas-microsoft-com:office:word" xmlns:w="http://schemas.openxmlformats.org/wordprocessingml/2006/main" xmlns:w14="http://schemas.microsoft.com/office/word/2010/wordml" xmlns:w15="http://schemas.microsoft.com/office/word/2012/wordml" xmlns:w16cex="http://schemas.microsoft.com/office/word/2018/wordml/cex" xmlns:w16cid="http://schemas.microsoft.com/office/word/2016/wordml/cid" xmlns:w16="http://schemas.microsoft.com/office/word/2018/wordml" xmlns:w16du="http://schemas.microsoft.com/office/word/2023/wordml/word16du" xmlns:w16sdtdh="http://schemas.microsoft.com/office/word/2020/wordml/sdtdatahash" xmlns:w16se="http://schemas.microsoft.com/office/word/2015/wordml/symex" xmlns:wpg="http://schemas.microsoft.com/office/word/2010/wordprocessingGroup" xmlns:wpi="http://schemas.microsoft.com/office/word/2010/wordprocessingInk" xmlns:wne="http://schemas.microsoft.com/office/word/2006/wordml" xmlns:wps="http://schemas.microsoft.com/office/word/2010/wordprocessingShape" mc:Ignorable="w14 w15 w16se w16cid w16 w16cex w16sdtdh w16du wp14">
   <w:abstractNum w:abstractNumId="0" w15:restartNumberingAfterBreak="0">
     <w:nsid w:val="02646EBE"/>
     <w:multiLevelType w:val="hybridMultilevel"/>
@@ -3655,7 +3702,7 @@
 </file>
 
 <file path=word/styles.xml><?xml version="1.0" encoding="utf-8"?>
-<w:styles xmlns:mc="http://schemas.openxmlformats.org/markup-compatibility/2006" xmlns:r="http://schemas.openxmlformats.org/officeDocument/2006/relationships" xmlns:w="http://schemas.openxmlformats.org/wordprocessingml/2006/main" xmlns:w14="http://schemas.microsoft.com/office/word/2010/wordml" xmlns:w15="http://schemas.microsoft.com/office/word/2012/wordml" xmlns:w16cex="http://schemas.microsoft.com/office/word/2018/wordml/cex" xmlns:w16cid="http://schemas.microsoft.com/office/word/2016/wordml/cid" xmlns:w16="http://schemas.microsoft.com/office/word/2018/wordml" xmlns:w16du="http://schemas.microsoft.com/office/word/2023/wordml/word16du" xmlns:w16sdtdh="http://schemas.microsoft.com/office/word/2020/wordml/sdtdatahash" xmlns:w16sdtfl="http://schemas.microsoft.com/office/word/2024/wordml/sdtformatlock" xmlns:w16se="http://schemas.microsoft.com/office/word/2015/wordml/symex" mc:Ignorable="w14 w15 w16se w16cid w16 w16cex w16sdtdh w16sdtfl w16du">
+<w:styles xmlns:mc="http://schemas.openxmlformats.org/markup-compatibility/2006" xmlns:r="http://schemas.openxmlformats.org/officeDocument/2006/relationships" xmlns:w="http://schemas.openxmlformats.org/wordprocessingml/2006/main" xmlns:w14="http://schemas.microsoft.com/office/word/2010/wordml" xmlns:w15="http://schemas.microsoft.com/office/word/2012/wordml" xmlns:w16cex="http://schemas.microsoft.com/office/word/2018/wordml/cex" xmlns:w16cid="http://schemas.microsoft.com/office/word/2016/wordml/cid" xmlns:w16="http://schemas.microsoft.com/office/word/2018/wordml" xmlns:w16du="http://schemas.microsoft.com/office/word/2023/wordml/word16du" xmlns:w16sdtdh="http://schemas.microsoft.com/office/word/2020/wordml/sdtdatahash" xmlns:w16se="http://schemas.microsoft.com/office/word/2015/wordml/symex" mc:Ignorable="w14 w15 w16se w16cid w16 w16cex w16sdtdh w16du">
   <w:docDefaults>
     <w:rPrDefault>
       <w:rPr>
@@ -4261,7 +4308,6 @@
   <w:style w:type="character" w:default="1" w:styleId="Fuentedeprrafopredeter">
     <w:name w:val="Default Paragraph Font"/>
     <w:uiPriority w:val="1"/>
-    <w:semiHidden/>
     <w:unhideWhenUsed/>
   </w:style>
   <w:style w:type="table" w:default="1" w:styleId="Tablanormal">
@@ -5678,6 +5724,10 @@
 </file>
 
 <file path=customXml/item1.xml><?xml version="1.0" encoding="utf-8"?>
+<b:Sources xmlns:b="http://schemas.openxmlformats.org/officeDocument/2006/bibliography" xmlns="http://schemas.openxmlformats.org/officeDocument/2006/bibliography" SelectedStyle="\APASixthEditionOfficeOnline.xsl" StyleName="APA" Version="6"/>
+</file>
+
+<file path=customXml/item2.xml><?xml version="1.0" encoding="utf-8"?>
 <?mso-contentType ?>
 <FormTemplates xmlns="http://schemas.microsoft.com/sharepoint/v3/contenttype/forms">
   <Display>DocumentLibraryForm</Display>
@@ -5686,11 +5736,55 @@
 </FormTemplates>
 </file>
 
-<file path=customXml/item2.xml><?xml version="1.0" encoding="utf-8"?>
-<b:Sources xmlns:b="http://schemas.openxmlformats.org/officeDocument/2006/bibliography" xmlns="http://schemas.openxmlformats.org/officeDocument/2006/bibliography" SelectedStyle="\APASixthEditionOfficeOnline.xsl" StyleName="APA" Version="6"/>
+<file path=customXml/item3.xml><?xml version="1.0" encoding="utf-8"?>
+<p:properties xmlns:p="http://schemas.microsoft.com/office/2006/metadata/properties" xmlns:xsi="http://www.w3.org/2001/XMLSchema-instance" xmlns:pc="http://schemas.microsoft.com/office/infopath/2007/PartnerControls">
+  <documentManagement>
+    <SharedWithUsers xmlns="85e30bcc-d76c-4413-8e4d-2dce22fb0743">
+      <UserInfo>
+        <DisplayName>Dario Ernesto Correal Torres</DisplayName>
+        <AccountId>15</AccountId>
+        <AccountType/>
+      </UserInfo>
+      <UserInfo>
+        <DisplayName>Carlos Andres Lozano Garzon</DisplayName>
+        <AccountId>13</AccountId>
+        <AccountType/>
+      </UserInfo>
+      <UserInfo>
+        <DisplayName>Mario  Fernando De la rosa Rosero</DisplayName>
+        <AccountId>16</AccountId>
+        <AccountType/>
+      </UserInfo>
+      <UserInfo>
+        <DisplayName>Arturo Henao Chaparro</DisplayName>
+        <AccountId>48</AccountId>
+        <AccountType/>
+      </UserInfo>
+      <UserInfo>
+        <DisplayName>Luis Esteban Florez Salamanca</DisplayName>
+        <AccountId>33</AccountId>
+        <AccountType/>
+      </UserInfo>
+      <UserInfo>
+        <DisplayName>Christian Camilo Aparicio Baquen</DisplayName>
+        <AccountId>50</AccountId>
+        <AccountType/>
+      </UserInfo>
+      <UserInfo>
+        <DisplayName>Ivan David Salazar Cardenas</DisplayName>
+        <AccountId>52</AccountId>
+        <AccountType/>
+      </UserInfo>
+    </SharedWithUsers>
+    <TaxCatchAll xmlns="85e30bcc-d76c-4413-8e4d-2dce22fb0743" xsi:nil="true"/>
+    <lcf76f155ced4ddcb4097134ff3c332f xmlns="164883f8-7691-4ecf-b54a-664c0d0edefe">
+      <Terms xmlns="http://schemas.microsoft.com/office/infopath/2007/PartnerControls"/>
+    </lcf76f155ced4ddcb4097134ff3c332f>
+  </documentManagement>
+</p:properties>
 </file>
 
-<file path=customXml/item3.xml><?xml version="1.0" encoding="utf-8"?>
+<file path=customXml/item4.xml><?xml version="1.0" encoding="utf-8"?>
 <ct:contentTypeSchema xmlns:ct="http://schemas.microsoft.com/office/2006/metadata/contentType" xmlns:ma="http://schemas.microsoft.com/office/2006/metadata/properties/metaAttributes" ct:_="" ma:_="" ma:contentTypeName="Documento" ma:contentTypeID="0x01010023858CF01A2EF24688B692775F4C60A4" ma:contentTypeVersion="15" ma:contentTypeDescription="Crear nuevo documento." ma:contentTypeScope="" ma:versionID="a4df9e4b793c0fa050084ef4feafa589">
   <xsd:schema xmlns:xsd="http://www.w3.org/2001/XMLSchema" xmlns:xs="http://www.w3.org/2001/XMLSchema" xmlns:p="http://schemas.microsoft.com/office/2006/metadata/properties" xmlns:ns2="164883f8-7691-4ecf-b54a-664c0d0edefe" xmlns:ns3="85e30bcc-d76c-4413-8e4d-2dce22fb0743" targetNamespace="http://schemas.microsoft.com/office/2006/metadata/properties" ma:root="true" ma:fieldsID="067b7080d2289f9ba15465beea7d18a8" ns2:_="" ns3:_="">
     <xsd:import namespace="164883f8-7691-4ecf-b54a-664c0d0edefe"/>
@@ -5927,55 +6021,15 @@
 </ct:contentTypeSchema>
 </file>
 
-<file path=customXml/item4.xml><?xml version="1.0" encoding="utf-8"?>
-<p:properties xmlns:p="http://schemas.microsoft.com/office/2006/metadata/properties" xmlns:xsi="http://www.w3.org/2001/XMLSchema-instance" xmlns:pc="http://schemas.microsoft.com/office/infopath/2007/PartnerControls">
-  <documentManagement>
-    <SharedWithUsers xmlns="85e30bcc-d76c-4413-8e4d-2dce22fb0743">
-      <UserInfo>
-        <DisplayName>Dario Ernesto Correal Torres</DisplayName>
-        <AccountId>15</AccountId>
-        <AccountType/>
-      </UserInfo>
-      <UserInfo>
-        <DisplayName>Carlos Andres Lozano Garzon</DisplayName>
-        <AccountId>13</AccountId>
-        <AccountType/>
-      </UserInfo>
-      <UserInfo>
-        <DisplayName>Mario  Fernando De la rosa Rosero</DisplayName>
-        <AccountId>16</AccountId>
-        <AccountType/>
-      </UserInfo>
-      <UserInfo>
-        <DisplayName>Arturo Henao Chaparro</DisplayName>
-        <AccountId>48</AccountId>
-        <AccountType/>
-      </UserInfo>
-      <UserInfo>
-        <DisplayName>Luis Esteban Florez Salamanca</DisplayName>
-        <AccountId>33</AccountId>
-        <AccountType/>
-      </UserInfo>
-      <UserInfo>
-        <DisplayName>Christian Camilo Aparicio Baquen</DisplayName>
-        <AccountId>50</AccountId>
-        <AccountType/>
-      </UserInfo>
-      <UserInfo>
-        <DisplayName>Ivan David Salazar Cardenas</DisplayName>
-        <AccountId>52</AccountId>
-        <AccountType/>
-      </UserInfo>
-    </SharedWithUsers>
-    <TaxCatchAll xmlns="85e30bcc-d76c-4413-8e4d-2dce22fb0743" xsi:nil="true"/>
-    <lcf76f155ced4ddcb4097134ff3c332f xmlns="164883f8-7691-4ecf-b54a-664c0d0edefe">
-      <Terms xmlns="http://schemas.microsoft.com/office/infopath/2007/PartnerControls"/>
-    </lcf76f155ced4ddcb4097134ff3c332f>
-  </documentManagement>
-</p:properties>
+<file path=customXml/itemProps1.xml><?xml version="1.0" encoding="utf-8"?>
+<ds:datastoreItem xmlns:ds="http://schemas.openxmlformats.org/officeDocument/2006/customXml" ds:itemID="{794BE61C-5254-4531-868C-EC2590174185}">
+  <ds:schemaRefs>
+    <ds:schemaRef ds:uri="http://schemas.openxmlformats.org/officeDocument/2006/bibliography"/>
+  </ds:schemaRefs>
+</ds:datastoreItem>
 </file>
 
-<file path=customXml/itemProps1.xml><?xml version="1.0" encoding="utf-8"?>
+<file path=customXml/itemProps2.xml><?xml version="1.0" encoding="utf-8"?>
 <ds:datastoreItem xmlns:ds="http://schemas.openxmlformats.org/officeDocument/2006/customXml" ds:itemID="{58AFF83A-2C1F-4B0C-9BCE-EE49F5226348}">
   <ds:schemaRefs>
     <ds:schemaRef ds:uri="http://schemas.microsoft.com/sharepoint/v3/contenttype/forms"/>
@@ -5983,15 +6037,18 @@
 </ds:datastoreItem>
 </file>
 
-<file path=customXml/itemProps2.xml><?xml version="1.0" encoding="utf-8"?>
-<ds:datastoreItem xmlns:ds="http://schemas.openxmlformats.org/officeDocument/2006/customXml" ds:itemID="{794BE61C-5254-4531-868C-EC2590174185}">
+<file path=customXml/itemProps3.xml><?xml version="1.0" encoding="utf-8"?>
+<ds:datastoreItem xmlns:ds="http://schemas.openxmlformats.org/officeDocument/2006/customXml" ds:itemID="{D3B4676A-CA48-4E6B-BABE-1535A7A288F6}">
   <ds:schemaRefs>
-    <ds:schemaRef ds:uri="http://schemas.openxmlformats.org/officeDocument/2006/bibliography"/>
+    <ds:schemaRef ds:uri="http://schemas.microsoft.com/office/2006/metadata/properties"/>
+    <ds:schemaRef ds:uri="http://schemas.microsoft.com/office/infopath/2007/PartnerControls"/>
+    <ds:schemaRef ds:uri="85e30bcc-d76c-4413-8e4d-2dce22fb0743"/>
+    <ds:schemaRef ds:uri="164883f8-7691-4ecf-b54a-664c0d0edefe"/>
   </ds:schemaRefs>
 </ds:datastoreItem>
 </file>
 
-<file path=customXml/itemProps3.xml><?xml version="1.0" encoding="utf-8"?>
+<file path=customXml/itemProps4.xml><?xml version="1.0" encoding="utf-8"?>
 <ds:datastoreItem xmlns:ds="http://schemas.openxmlformats.org/officeDocument/2006/customXml" ds:itemID="{62F3E371-4CEE-4871-A936-27DA1639FADD}">
   <ds:schemaRefs>
     <ds:schemaRef ds:uri="http://schemas.microsoft.com/office/2006/metadata/contentType"/>
@@ -6008,15 +6065,4 @@
     <ds:schemaRef ds:uri="http://schemas.microsoft.com/internal/obd"/>
   </ds:schemaRefs>
 </ds:datastoreItem>
-</file>
-
-<file path=customXml/itemProps4.xml><?xml version="1.0" encoding="utf-8"?>
-<ds:datastoreItem xmlns:ds="http://schemas.openxmlformats.org/officeDocument/2006/customXml" ds:itemID="{D3B4676A-CA48-4E6B-BABE-1535A7A288F6}">
-  <ds:schemaRefs>
-    <ds:schemaRef ds:uri="http://schemas.microsoft.com/office/2006/metadata/properties"/>
-    <ds:schemaRef ds:uri="http://schemas.microsoft.com/office/infopath/2007/PartnerControls"/>
-    <ds:schemaRef ds:uri="85e30bcc-d76c-4413-8e4d-2dce22fb0743"/>
-    <ds:schemaRef ds:uri="164883f8-7691-4ecf-b54a-664c0d0edefe"/>
-  </ds:schemaRefs>
-</ds:datastoreItem>
 </file>
</xml_diff>